<commit_message>
Republish Tesla (TSLA) study — corrected five-lens synthesis (weighted central USD 254, −40%; autonomy-at-scale carries 25% weight) and rebuilt three-expert panel (Expert 3 scenario real-options ~USD 350, near spot); refresh docx/pdf/xlsx, data.js fair {105/254/350}, EN+AR pages and listings; file token v=0108, site cache-bust v=20260701f
</commit_message>
<xml_diff>
--- a/files/TSLA_Valuation_Study_30-06-2026_public.docx
+++ b/files/TSLA_Valuation_Study_30-06-2026_public.docx
@@ -208,7 +208,7 @@
           <w:sz w:val="19"/>
           <w:szCs w:val="19"/>
         </w:rPr>
-        <w:t xml:space="preserve">At USD 420.60 the shares sit well above our weighted central estimate of USD 174 — an unusually wide gap that says less about the operating businesses, which are genuinely valuable, than about the option stacked on top of them. Tesla is the world's most valuable automaker, a profitable EV maker and a fast-growing energy-storage business, wrapped around an autonomy-and-robotics ambition (FSD, Robotaxi, Optimus) whose cash flows do not yet exist. FY2025 was the first annual revenue decline in Tesla's history (revenue −3% to USD 94.8bn) and GAAP net income fell to USD 3.79bn, leaving the stock on roughly 360× trailing earnings. The question is not whether Tesla owns a valuable operating business — it plainly does — but whether the ~USD 1.1tn of market value above that business will be earned by the autonomy bet.</w:t>
+        <w:t xml:space="preserve">At USD 420.60 the shares sit well above our weighted central estimate of USD 254 — a wide gap that says less about the operating businesses, which are genuinely valuable, than about the option stacked on top of them. Tesla is the world's most valuable automaker, a profitable EV maker and a fast-growing energy-storage business, wrapped around an autonomy-and-robotics ambition (FSD, Robotaxi, Optimus) whose cash flows do not yet exist. FY2025 was the first annual revenue decline in Tesla's history (revenue −3% to USD 94.8bn) and GAAP net income fell to USD 3.79bn, leaving the stock on roughly 360× trailing earnings. The question is not whether Tesla owns a valuable operating business — it plainly does — but whether the ~USD 1.1tn of market value above that business will be earned by the autonomy bet.</w:t>
       </w:r>
     </w:p>
     <w:p>
@@ -221,7 +221,7 @@
           <w:sz w:val="19"/>
           <w:szCs w:val="19"/>
         </w:rPr>
-        <w:t xml:space="preserve">Four fundamental lenses land between USD 90 and USD 230 — a spot-anchored sum-of-the-parts (USD 230), a consolidated DCF (USD 90), a relative-multiple read (USD 175) and a normalized-earnings read (USD 150) — for a weighted central of USD 174, about 59% below spot; only the case in which the autonomy option is credited at full scale (USD 560) exceeds the price. The dispersion is driven almost entirely by one input, the value assigned to the autonomy option: on the operating businesses alone the stock is expensive, while a world in which Robotaxi and Optimus scale supports a price well above it. The width of that range — USD 90 to USD 560 — is the honest measure of how much the answer depends on an outcome that has not happened.</w:t>
+        <w:t xml:space="preserve">Five fundamental lenses span USD 90 to USD 560 — a segment sum-of-the-parts (USD 230), a consolidated DCF (USD 90), a relative-multiple read (USD 175), a normalized-earnings read (USD 130), and — carrying a full quarter of the weight — the autonomy-at-scale case in which the option is credited close to full value (USD 560) — for a weighted central of USD 254, about 40% below spot. The autonomy case is not a footnote to the operating value; it is given explicit weight, because the option is the whole reason the stock trades where it does. The dispersion is driven almost entirely by one input, the value assigned to the autonomy option: on the operating businesses alone the stock is expensive, while a world in which Robotaxi and Optimus scale supports a price well above it. The width of that range — USD 90 to USD 560 — is the honest measure of how much the answer depends on an outcome that has not happened.</w:t>
       </w:r>
     </w:p>
     <w:p>
@@ -472,7 +472,7 @@
                 <w:sz w:val="17"/>
                 <w:szCs w:val="17"/>
               </w:rPr>
-              <w:t xml:space="preserve">Sum-of-the-parts (primary)</w:t>
+              <w:t xml:space="preserve">Sum-of-the-parts — base (primary)</w:t>
             </w:r>
           </w:p>
         </w:tc>
@@ -870,7 +870,7 @@
                 <w:sz w:val="17"/>
                 <w:szCs w:val="17"/>
               </w:rPr>
-              <w:t xml:space="preserve">USD 150</w:t>
+              <w:t xml:space="preserve">USD 130</w:t>
             </w:r>
           </w:p>
         </w:tc>
@@ -898,7 +898,7 @@
                 <w:sz w:val="17"/>
                 <w:szCs w:val="17"/>
               </w:rPr>
-              <w:t xml:space="preserve">−64%</w:t>
+              <w:t xml:space="preserve">−69%</w:t>
             </w:r>
           </w:p>
         </w:tc>
@@ -922,19 +922,75 @@
             <w:r>
               <w:rPr>
                 <w:rFonts w:ascii="Calibri" w:cs="Calibri" w:eastAsia="Calibri" w:hAnsi="Calibri"/>
+                <w:b w:val="false"/>
+                <w:bCs w:val="false"/>
+                <w:color w:val="222222"/>
+                <w:sz w:val="17"/>
+                <w:szCs w:val="17"/>
+              </w:rPr>
+              <w:t xml:space="preserve">Autonomy-at-scale (SOTP bull)</w:t>
+            </w:r>
+          </w:p>
+        </w:tc>
+        <w:tc>
+          <w:tcPr>
+            <w:tcW w:type="dxa" w:w="3300"/>
+            <w:tcMar>
+              <w:top w:type="dxa" w:w="40"/>
+              <w:left w:type="dxa" w:w="80"/>
+              <w:bottom w:type="dxa" w:w="40"/>
+              <w:right w:type="dxa" w:w="80"/>
+            </w:tcMar>
+          </w:tcPr>
+          <w:p>
+            <w:pPr>
+              <w:spacing w:after="0"/>
+              <w:jc w:val="left"/>
+            </w:pPr>
+            <w:r>
+              <w:rPr>
+                <w:rFonts w:ascii="Calibri" w:cs="Calibri" w:eastAsia="Calibri" w:hAnsi="Calibri"/>
+                <w:b w:val="false"/>
+                <w:bCs w:val="false"/>
+                <w:color w:val="222222"/>
+                <w:sz w:val="17"/>
+                <w:szCs w:val="17"/>
+              </w:rPr>
+              <w:t xml:space="preserve">Option credited close to full value</w:t>
+            </w:r>
+          </w:p>
+        </w:tc>
+        <w:tc>
+          <w:tcPr>
+            <w:tcW w:type="dxa" w:w="1400"/>
+            <w:tcMar>
+              <w:top w:type="dxa" w:w="40"/>
+              <w:left w:type="dxa" w:w="80"/>
+              <w:bottom w:type="dxa" w:w="40"/>
+              <w:right w:type="dxa" w:w="80"/>
+            </w:tcMar>
+          </w:tcPr>
+          <w:p>
+            <w:pPr>
+              <w:spacing w:after="0"/>
+              <w:jc w:val="right"/>
+            </w:pPr>
+            <w:r>
+              <w:rPr>
+                <w:rFonts w:ascii="Calibri" w:cs="Calibri" w:eastAsia="Calibri" w:hAnsi="Calibri"/>
                 <w:b/>
                 <w:bCs/>
                 <w:color w:val="222222"/>
                 <w:sz w:val="17"/>
                 <w:szCs w:val="17"/>
               </w:rPr>
-              <w:t xml:space="preserve">Weighted central</w:t>
-            </w:r>
-          </w:p>
-        </w:tc>
-        <w:tc>
-          <w:tcPr>
-            <w:tcW w:type="dxa" w:w="3300"/>
+              <w:t xml:space="preserve">USD 560</w:t>
+            </w:r>
+          </w:p>
+        </w:tc>
+        <w:tc>
+          <w:tcPr>
+            <w:tcW w:type="dxa" w:w="1600"/>
             <w:tcMar>
               <w:top w:type="dxa" w:w="40"/>
               <w:left w:type="dxa" w:w="80"/>
@@ -956,24 +1012,26 @@
                 <w:sz w:val="17"/>
                 <w:szCs w:val="17"/>
               </w:rPr>
-              <w:t xml:space="preserve">Blend 40 / 20 / 15 / 25</w:t>
-            </w:r>
-          </w:p>
-        </w:tc>
-        <w:tc>
-          <w:tcPr>
-            <w:tcW w:type="dxa" w:w="1400"/>
-            <w:tcMar>
-              <w:top w:type="dxa" w:w="40"/>
-              <w:left w:type="dxa" w:w="80"/>
-              <w:bottom w:type="dxa" w:w="40"/>
-              <w:right w:type="dxa" w:w="80"/>
-            </w:tcMar>
-          </w:tcPr>
-          <w:p>
-            <w:pPr>
-              <w:spacing w:after="0"/>
-              <w:jc w:val="right"/>
+              <w:t xml:space="preserve">+33% (25% weight)</w:t>
+            </w:r>
+          </w:p>
+        </w:tc>
+      </w:tr>
+      <w:tr>
+        <w:tc>
+          <w:tcPr>
+            <w:tcW w:type="dxa" w:w="3060"/>
+            <w:tcMar>
+              <w:top w:type="dxa" w:w="40"/>
+              <w:left w:type="dxa" w:w="80"/>
+              <w:bottom w:type="dxa" w:w="40"/>
+              <w:right w:type="dxa" w:w="80"/>
+            </w:tcMar>
+          </w:tcPr>
+          <w:p>
+            <w:pPr>
+              <w:spacing w:after="0"/>
+              <w:jc w:val="left"/>
             </w:pPr>
             <w:r>
               <w:rPr>
@@ -984,13 +1042,13 @@
                 <w:sz w:val="17"/>
                 <w:szCs w:val="17"/>
               </w:rPr>
-              <w:t xml:space="preserve">USD 174</w:t>
-            </w:r>
-          </w:p>
-        </w:tc>
-        <w:tc>
-          <w:tcPr>
-            <w:tcW w:type="dxa" w:w="1600"/>
+              <w:t xml:space="preserve">Weighted central</w:t>
+            </w:r>
+          </w:p>
+        </w:tc>
+        <w:tc>
+          <w:tcPr>
+            <w:tcW w:type="dxa" w:w="3300"/>
             <w:tcMar>
               <w:top w:type="dxa" w:w="40"/>
               <w:left w:type="dxa" w:w="80"/>
@@ -1002,6 +1060,34 @@
             <w:pPr>
               <w:spacing w:after="0"/>
               <w:jc w:val="left"/>
+            </w:pPr>
+            <w:r>
+              <w:rPr>
+                <w:rFonts w:ascii="Calibri" w:cs="Calibri" w:eastAsia="Calibri" w:hAnsi="Calibri"/>
+                <w:b w:val="false"/>
+                <w:bCs w:val="false"/>
+                <w:color w:val="222222"/>
+                <w:sz w:val="17"/>
+                <w:szCs w:val="17"/>
+              </w:rPr>
+              <w:t xml:space="preserve">Five-lens weighted blend</w:t>
+            </w:r>
+          </w:p>
+        </w:tc>
+        <w:tc>
+          <w:tcPr>
+            <w:tcW w:type="dxa" w:w="1400"/>
+            <w:tcMar>
+              <w:top w:type="dxa" w:w="40"/>
+              <w:left w:type="dxa" w:w="80"/>
+              <w:bottom w:type="dxa" w:w="40"/>
+              <w:right w:type="dxa" w:w="80"/>
+            </w:tcMar>
+          </w:tcPr>
+          <w:p>
+            <w:pPr>
+              <w:spacing w:after="0"/>
+              <w:jc w:val="right"/>
             </w:pPr>
             <w:r>
               <w:rPr>
@@ -1012,7 +1098,35 @@
                 <w:sz w:val="17"/>
                 <w:szCs w:val="17"/>
               </w:rPr>
-              <w:t xml:space="preserve">−59% vs USD 420.60</w:t>
+              <w:t xml:space="preserve">USD 254</w:t>
+            </w:r>
+          </w:p>
+        </w:tc>
+        <w:tc>
+          <w:tcPr>
+            <w:tcW w:type="dxa" w:w="1600"/>
+            <w:tcMar>
+              <w:top w:type="dxa" w:w="40"/>
+              <w:left w:type="dxa" w:w="80"/>
+              <w:bottom w:type="dxa" w:w="40"/>
+              <w:right w:type="dxa" w:w="80"/>
+            </w:tcMar>
+          </w:tcPr>
+          <w:p>
+            <w:pPr>
+              <w:spacing w:after="0"/>
+              <w:jc w:val="left"/>
+            </w:pPr>
+            <w:r>
+              <w:rPr>
+                <w:rFonts w:ascii="Calibri" w:cs="Calibri" w:eastAsia="Calibri" w:hAnsi="Calibri"/>
+                <w:b/>
+                <w:bCs/>
+                <w:color w:val="222222"/>
+                <w:sz w:val="17"/>
+                <w:szCs w:val="17"/>
+              </w:rPr>
+              <w:t xml:space="preserve">−40% vs USD 420.60</w:t>
             </w:r>
           </w:p>
         </w:tc>
@@ -1591,7 +1705,7 @@
                 <w:sz w:val="17"/>
                 <w:szCs w:val="17"/>
               </w:rPr>
-              <w:t xml:space="preserve">Expert 1 — SOTP + option</w:t>
+              <w:t xml:space="preserve">Expert 1 — cash returns (DCF/ROIC)</w:t>
             </w:r>
           </w:p>
         </w:tc>
@@ -1619,7 +1733,7 @@
                 <w:sz w:val="17"/>
                 <w:szCs w:val="17"/>
               </w:rPr>
-              <w:t xml:space="preserve">Risk-weighted option on marked segments</w:t>
+              <w:t xml:space="preserve">Operating cash vs ~10% WACC</w:t>
             </w:r>
           </w:p>
         </w:tc>
@@ -1647,7 +1761,7 @@
                 <w:sz w:val="17"/>
                 <w:szCs w:val="17"/>
               </w:rPr>
-              <w:t xml:space="preserve">USD 230</w:t>
+              <w:t xml:space="preserve">USD 105</w:t>
             </w:r>
           </w:p>
         </w:tc>
@@ -1675,7 +1789,7 @@
                 <w:sz w:val="17"/>
                 <w:szCs w:val="17"/>
               </w:rPr>
-              <w:t xml:space="preserve">The anchor</w:t>
+              <w:t xml:space="preserve">Most conservative</w:t>
             </w:r>
           </w:p>
         </w:tc>
@@ -1705,7 +1819,7 @@
                 <w:sz w:val="17"/>
                 <w:szCs w:val="17"/>
               </w:rPr>
-              <w:t xml:space="preserve">Expert 2 — normalized earnings</w:t>
+              <w:t xml:space="preserve">Expert 2 — sum-of-the-parts + option</w:t>
             </w:r>
           </w:p>
         </w:tc>
@@ -1733,7 +1847,7 @@
                 <w:sz w:val="17"/>
                 <w:szCs w:val="17"/>
               </w:rPr>
-              <w:t xml:space="preserve">Mid-cycle earnings × multiple</w:t>
+              <w:t xml:space="preserve">Risk-weighted autonomy option</w:t>
             </w:r>
           </w:p>
         </w:tc>
@@ -1761,7 +1875,7 @@
                 <w:sz w:val="17"/>
                 <w:szCs w:val="17"/>
               </w:rPr>
-              <w:t xml:space="preserve">USD 175</w:t>
+              <w:t xml:space="preserve">USD 230</w:t>
             </w:r>
           </w:p>
         </w:tc>
@@ -1789,7 +1903,7 @@
                 <w:sz w:val="17"/>
                 <w:szCs w:val="17"/>
               </w:rPr>
-              <w:t xml:space="preserve">The middle</w:t>
+              <w:t xml:space="preserve">The anchor</w:t>
             </w:r>
           </w:p>
         </w:tc>
@@ -1819,7 +1933,7 @@
                 <w:sz w:val="17"/>
                 <w:szCs w:val="17"/>
               </w:rPr>
-              <w:t xml:space="preserve">Expert 3 — cash returns (DCF+ROIC)</w:t>
+              <w:t xml:space="preserve">Expert 3 — scenario real-options</w:t>
             </w:r>
           </w:p>
         </w:tc>
@@ -1847,7 +1961,7 @@
                 <w:sz w:val="17"/>
                 <w:szCs w:val="17"/>
               </w:rPr>
-              <w:t xml:space="preserve">Return on capital vs ~10% WACC</w:t>
+              <w:t xml:space="preserve">Probability-weighted autonomy tree</w:t>
             </w:r>
           </w:p>
         </w:tc>
@@ -1875,7 +1989,7 @@
                 <w:sz w:val="17"/>
                 <w:szCs w:val="17"/>
               </w:rPr>
-              <w:t xml:space="preserve">USD 105</w:t>
+              <w:t xml:space="preserve">USD 350</w:t>
             </w:r>
           </w:p>
         </w:tc>
@@ -1903,7 +2017,7 @@
                 <w:sz w:val="17"/>
                 <w:szCs w:val="17"/>
               </w:rPr>
-              <w:t xml:space="preserve">Most conservative</w:t>
+              <w:t xml:space="preserve">Prices the option; nearest spot</w:t>
             </w:r>
           </w:p>
         </w:tc>
@@ -1989,7 +2103,7 @@
                 <w:sz w:val="17"/>
                 <w:szCs w:val="17"/>
               </w:rPr>
-              <w:t xml:space="preserve">USD 105–230</w:t>
+              <w:t xml:space="preserve">USD 105–350</w:t>
             </w:r>
           </w:p>
         </w:tc>
@@ -2017,7 +2131,7 @@
                 <w:sz w:val="17"/>
                 <w:szCs w:val="17"/>
               </w:rPr>
-              <w:t xml:space="preserve">Centres ~USD 170</w:t>
+              <w:t xml:space="preserve">Straddles the USD 254 central</w:t>
             </w:r>
           </w:p>
         </w:tc>
@@ -2043,7 +2157,7 @@
           <w:sz w:val="19"/>
           <w:szCs w:val="19"/>
         </w:rPr>
-        <w:t xml:space="preserve">Every fundamental read points the same way — the operating businesses are worth far less than the price — and the reads disagree only on how much to pay for the autonomy option on top. The four lenses cluster at USD 90–230 for a central near USD 174, ~59% below the USD 420.60 spot; the three experts span USD 105–230 at base, and each turns on a single question: how likely, how large and how soon Robotaxi, unsupervised FSD and Optimus become real, high-margin businesses. Only the autonomy-at-scale case (~USD 560) exceeds spot. The technical tape is the lone dissenter to the caution, constructive and turning up, which is why the three-month distribution centres near spot with a wide band rather than already at fundamental value.</w:t>
+        <w:t xml:space="preserve">The debate is not about Tesla’s operating businesses — which are genuinely valuable — but about how much to pay for the autonomy option on top, and the five lenses are built to make that explicit. The operating reads cluster at USD 90–230, the autonomy-at-scale case reaches USD 560, and giving that case a full quarter of the weight lands a central of USD 254 (−40% vs the USD 420.60 spot). The three experts span USD 105–350 and straddle that central: one prices only the operating cash (USD 105), one the segments plus a risk-weighted option (USD 230), and one runs a probability-weighted scenario tree that lands near spot (USD 350) and reaches it if the autonomy outcome is weighted at ~40%. Each turns on a single question — how likely, how large and how soon Robotaxi, unsupervised FSD and Optimus become real, high-margin businesses. The technical tape is constructive and turning up, which is why the three-month distribution centres near spot with a wide band.</w:t>
       </w:r>
     </w:p>
     <w:p>
@@ -3128,7 +3242,7 @@
           <w:sz w:val="19"/>
           <w:szCs w:val="19"/>
         </w:rPr>
-        <w:t xml:space="preserve">We value Tesla as an operating company that houses three quite different businesses — a large, profitable but maturing automaker, a fast-growing energy-storage business, and a small services arm — sitting beneath one very large option on autonomy and robotics, and we triangulate four lenses. The primary lens is a segment sum-of-the-parts (SOTP), because the pieces trade on different economics and — crucially — because it is the only frame that cleanly separates the operating businesses, which can be valued with reasonable confidence, from the autonomy option, which can only be probability-weighted. A consolidated DCF on the operating business, a relative-multiple cross-check and a normalized-earnings read complete the set. Reported financials are Tesla's disclosure; the operating projections, the option mark and the discount rate are our judgments, shown explicitly so you can disagree. The weights and the football field are in §1.5; the swing factor — the autonomy option — is dissected in §1.7 and the sensitivity grid in §1.9.</w:t>
+        <w:t xml:space="preserve">We value Tesla as an operating company that houses three quite different businesses — a large, profitable but maturing automaker, a fast-growing energy-storage business, and a small services arm — sitting beneath one very large option on autonomy and robotics, and we triangulate five lenses. The primary lens is a segment sum-of-the-parts (SOTP), because the pieces trade on different economics and — crucially — because it is the only frame that cleanly separates the operating businesses, which can be valued with reasonable confidence, from the autonomy option, which can only be probability-weighted. A consolidated DCF on the operating business, a relative-multiple cross-check, a normalized-earnings read, and — given explicit weight — the autonomy-at-scale case complete the set. Reported financials are Tesla's disclosure; the operating projections, the option mark and the discount rate are our judgments, shown explicitly so you can disagree. The weights and the football field are in §1.5; the swing factor — the autonomy option — is dissected in §1.7 and the sensitivity grid in §1.9.</w:t>
       </w:r>
     </w:p>
     <w:p>
@@ -7021,7 +7135,7 @@
           <w:sz w:val="19"/>
           <w:szCs w:val="19"/>
         </w:rPr>
-        <w:t xml:space="preserve">Strip out the peak-cycle distortions and the credit-driven tail, and ask what Tesla earns in a normal year. Normalising the automotive margin to a mid-cycle level, adding the growing energy and services contribution and a modest amount of high-margin software, a defensible through-cycle net profit is on the order of USD 14bn — well above the USD 3.79bn reported in the trough year of 2025 but a fraction of what the market capitalisation implies. At a ~35× multiple — a quality-growth premium, but applied to earnings that exclude the unproven autonomy businesses — that is </w:t>
+        <w:t xml:space="preserve">Strip out the peak-cycle distortions and the credit-driven tail, and ask what Tesla earns in a normal year. Normalising the automotive margin to a mid-cycle level, adding the growing energy and services contribution and a modest amount of high-margin software, a defensible through-cycle net profit is on the order of USD 12bn — well above the USD 3.79bn reported in the trough year of 2025 but a fraction of what the market capitalisation implies. At a ~35× multiple — a quality-growth premium, but applied to earnings that exclude the unproven autonomy businesses — that is </w:t>
       </w:r>
       <w:r>
         <w:rPr>
@@ -7031,7 +7145,7 @@
           <w:sz w:val="19"/>
           <w:szCs w:val="19"/>
         </w:rPr>
-        <w:t xml:space="preserve">USD 150</w:t>
+        <w:t xml:space="preserve">USD 130</w:t>
       </w:r>
       <w:r>
         <w:rPr>
@@ -7039,7 +7153,7 @@
           <w:sz w:val="19"/>
           <w:szCs w:val="19"/>
         </w:rPr>
-        <w:t xml:space="preserve"> (−64%). Like the relative lens, this measures only the operating earnings and so excludes the option that dominates the price; it is included as a discipline, not as the primary anchor.</w:t>
+        <w:t xml:space="preserve"> (−69%). Like the relative lens, this measures only the operating earnings and so excludes the option that dominates the price; it is included as a discipline, not as the primary anchor.</w:t>
       </w:r>
     </w:p>
     <w:p>
@@ -7056,7 +7170,7 @@
           <w:sz w:val="22"/>
           <w:szCs w:val="22"/>
         </w:rPr>
-        <w:t xml:space="preserve">1.5  Synthesis — four lenses</w:t>
+        <w:t xml:space="preserve">1.5  Synthesis — five lenses</w:t>
       </w:r>
     </w:p>
     <w:p>
@@ -7069,7 +7183,7 @@
           <w:sz w:val="19"/>
           <w:szCs w:val="19"/>
         </w:rPr>
-        <w:t xml:space="preserve">The four methods and weights are below. We anchor on the segment SOTP (the only lens that separates the operating businesses from the option), carry the consolidated DCF as a cash-flow cross-check, and split the balance across the relative and normalized reads. The autonomy-at-scale case is not a separate weighted lens — it is the upper end of the SOTP range, shown on the football field so its weight is visible rather than buried.</w:t>
+        <w:t xml:space="preserve">The five methods and weights are below. The segment SOTP is the primary framework — it is the only lens that cleanly separates the operating businesses from the autonomy option — while the two 25% anchors define the poles of the debate: the consolidated DCF, which prices the operating cash flows and ignores the option (the floor), and the autonomy-at-scale case, in which the option is credited close to full value (the ceiling). Crucially, the autonomy case is given real weight — a full quarter — rather than buried as a footnote, because the option is the entire reason the stock trades where it does; a study that weighted it at zero would be making a hidden bet that autonomy fails.</w:t>
       </w:r>
     </w:p>
     <w:tbl>
@@ -7323,7 +7437,7 @@
                 <w:sz w:val="17"/>
                 <w:szCs w:val="17"/>
               </w:rPr>
-              <w:t xml:space="preserve">40%</w:t>
+              <w:t xml:space="preserve">20%</w:t>
             </w:r>
           </w:p>
         </w:tc>
@@ -7357,7 +7471,7 @@
                 <w:sz w:val="17"/>
                 <w:szCs w:val="17"/>
               </w:rPr>
-              <w:t xml:space="preserve">Consolidated DCF (cross-check)</w:t>
+              <w:t xml:space="preserve">Consolidated DCF (cross-check) — floor</w:t>
             </w:r>
           </w:p>
         </w:tc>
@@ -7444,7 +7558,7 @@
                 <w:sz w:val="17"/>
                 <w:szCs w:val="17"/>
               </w:rPr>
-              <w:t xml:space="preserve">20%</w:t>
+              <w:t xml:space="preserve">25%</w:t>
             </w:r>
           </w:p>
         </w:tc>
@@ -7624,7 +7738,7 @@
                 <w:sz w:val="17"/>
                 <w:szCs w:val="17"/>
               </w:rPr>
-              <w:t xml:space="preserve">150</w:t>
+              <w:t xml:space="preserve">130</w:t>
             </w:r>
           </w:p>
         </w:tc>
@@ -7653,7 +7767,7 @@
                 <w:sz w:val="17"/>
                 <w:szCs w:val="17"/>
               </w:rPr>
-              <w:t xml:space="preserve">−64%</w:t>
+              <w:t xml:space="preserve">−69%</w:t>
             </w:r>
           </w:p>
         </w:tc>
@@ -7682,7 +7796,7 @@
                 <w:sz w:val="17"/>
                 <w:szCs w:val="17"/>
               </w:rPr>
-              <w:t xml:space="preserve">25%</w:t>
+              <w:t xml:space="preserve">15%</w:t>
             </w:r>
           </w:p>
         </w:tc>
@@ -7709,6 +7823,124 @@
             <w:r>
               <w:rPr>
                 <w:rFonts w:ascii="Calibri" w:cs="Calibri" w:eastAsia="Calibri" w:hAnsi="Calibri"/>
+                <w:b w:val="false"/>
+                <w:bCs w:val="false"/>
+                <w:color w:val="222222"/>
+                <w:sz w:val="17"/>
+                <w:szCs w:val="17"/>
+              </w:rPr>
+              <w:t xml:space="preserve">Autonomy-at-scale (SOTP bull) — ceiling</w:t>
+            </w:r>
+          </w:p>
+        </w:tc>
+        <w:tc>
+          <w:tcPr>
+            <w:tcW w:type="dxa" w:w="1700"/>
+            <w:tcMar>
+              <w:top w:type="dxa" w:w="40"/>
+              <w:left w:type="dxa" w:w="80"/>
+              <w:bottom w:type="dxa" w:w="40"/>
+              <w:right w:type="dxa" w:w="80"/>
+            </w:tcMar>
+          </w:tcPr>
+          <w:p>
+            <w:pPr>
+              <w:spacing w:after="0"/>
+              <w:jc w:val="right"/>
+            </w:pPr>
+            <w:r>
+              <w:rPr>
+                <w:rFonts w:ascii="Calibri" w:cs="Calibri" w:eastAsia="Calibri" w:hAnsi="Calibri"/>
+                <w:b w:val="false"/>
+                <w:bCs w:val="false"/>
+                <w:color w:val="222222"/>
+                <w:sz w:val="17"/>
+                <w:szCs w:val="17"/>
+              </w:rPr>
+              <w:t xml:space="preserve">560</w:t>
+            </w:r>
+          </w:p>
+        </w:tc>
+        <w:tc>
+          <w:tcPr>
+            <w:tcW w:type="dxa" w:w="1700"/>
+            <w:tcMar>
+              <w:top w:type="dxa" w:w="40"/>
+              <w:left w:type="dxa" w:w="80"/>
+              <w:bottom w:type="dxa" w:w="40"/>
+              <w:right w:type="dxa" w:w="80"/>
+            </w:tcMar>
+          </w:tcPr>
+          <w:p>
+            <w:pPr>
+              <w:spacing w:after="0"/>
+              <w:jc w:val="right"/>
+            </w:pPr>
+            <w:r>
+              <w:rPr>
+                <w:rFonts w:ascii="Calibri" w:cs="Calibri" w:eastAsia="Calibri" w:hAnsi="Calibri"/>
+                <w:b w:val="false"/>
+                <w:bCs w:val="false"/>
+                <w:color w:val="222222"/>
+                <w:sz w:val="17"/>
+                <w:szCs w:val="17"/>
+              </w:rPr>
+              <w:t xml:space="preserve">+33%</w:t>
+            </w:r>
+          </w:p>
+        </w:tc>
+        <w:tc>
+          <w:tcPr>
+            <w:tcW w:type="dxa" w:w="1700"/>
+            <w:tcMar>
+              <w:top w:type="dxa" w:w="40"/>
+              <w:left w:type="dxa" w:w="80"/>
+              <w:bottom w:type="dxa" w:w="40"/>
+              <w:right w:type="dxa" w:w="80"/>
+            </w:tcMar>
+          </w:tcPr>
+          <w:p>
+            <w:pPr>
+              <w:spacing w:after="0"/>
+              <w:jc w:val="right"/>
+            </w:pPr>
+            <w:r>
+              <w:rPr>
+                <w:rFonts w:ascii="Calibri" w:cs="Calibri" w:eastAsia="Calibri" w:hAnsi="Calibri"/>
+                <w:b w:val="false"/>
+                <w:bCs w:val="false"/>
+                <w:color w:val="222222"/>
+                <w:sz w:val="17"/>
+                <w:szCs w:val="17"/>
+              </w:rPr>
+              <w:t xml:space="preserve">25%</w:t>
+            </w:r>
+          </w:p>
+        </w:tc>
+      </w:tr>
+      <w:tr>
+        <w:trPr>
+          <w:tblHeader w:val="false"/>
+        </w:trPr>
+        <w:tc>
+          <w:tcPr>
+            <w:tcW w:type="dxa" w:w="4260"/>
+            <w:shd w:fill="F3F5F5" w:val="clear"/>
+            <w:tcMar>
+              <w:top w:type="dxa" w:w="40"/>
+              <w:left w:type="dxa" w:w="80"/>
+              <w:bottom w:type="dxa" w:w="40"/>
+              <w:right w:type="dxa" w:w="80"/>
+            </w:tcMar>
+          </w:tcPr>
+          <w:p>
+            <w:pPr>
+              <w:spacing w:after="0"/>
+              <w:jc w:val="left"/>
+            </w:pPr>
+            <w:r>
+              <w:rPr>
+                <w:rFonts w:ascii="Calibri" w:cs="Calibri" w:eastAsia="Calibri" w:hAnsi="Calibri"/>
                 <w:b/>
                 <w:bCs/>
                 <w:color w:val="222222"/>
@@ -7722,6 +7954,7 @@
         <w:tc>
           <w:tcPr>
             <w:tcW w:type="dxa" w:w="1700"/>
+            <w:shd w:fill="F3F5F5" w:val="clear"/>
             <w:tcMar>
               <w:top w:type="dxa" w:w="40"/>
               <w:left w:type="dxa" w:w="80"/>
@@ -7743,13 +7976,14 @@
                 <w:sz w:val="17"/>
                 <w:szCs w:val="17"/>
               </w:rPr>
-              <w:t xml:space="preserve">174</w:t>
+              <w:t xml:space="preserve">254</w:t>
             </w:r>
           </w:p>
         </w:tc>
         <w:tc>
           <w:tcPr>
             <w:tcW w:type="dxa" w:w="1700"/>
+            <w:shd w:fill="F3F5F5" w:val="clear"/>
             <w:tcMar>
               <w:top w:type="dxa" w:w="40"/>
               <w:left w:type="dxa" w:w="80"/>
@@ -7771,13 +8005,14 @@
                 <w:sz w:val="17"/>
                 <w:szCs w:val="17"/>
               </w:rPr>
-              <w:t xml:space="preserve">−59%</w:t>
+              <w:t xml:space="preserve">−40%</w:t>
             </w:r>
           </w:p>
         </w:tc>
         <w:tc>
           <w:tcPr>
             <w:tcW w:type="dxa" w:w="1700"/>
+            <w:shd w:fill="F3F5F5" w:val="clear"/>
             <w:tcMar>
               <w:top w:type="dxa" w:w="40"/>
               <w:left w:type="dxa" w:w="80"/>
@@ -7813,7 +8048,7 @@
       <w:r>
         <w:drawing>
           <wp:inline distT="0" distB="0" distL="0" distR="0">
-            <wp:extent cx="5334000" cy="2676525"/>
+            <wp:extent cx="5334000" cy="2686050"/>
             <wp:effectExtent t="0" r="0" b="0" l="0"/>
             <wp:docPr id="1" name="" descr="" title=""/>
             <wp:cNvGraphicFramePr>
@@ -7838,7 +8073,7 @@
                   <pic:spPr bwMode="auto">
                     <a:xfrm>
                       <a:off x="0" y="0"/>
-                      <a:ext cx="5334000" cy="2676525"/>
+                      <a:ext cx="5334000" cy="2686050"/>
                     </a:xfrm>
                     <a:prstGeom prst="rect">
                       <a:avLst/>
@@ -7864,7 +8099,7 @@
           <w:sz w:val="16"/>
           <w:szCs w:val="16"/>
         </w:rPr>
-        <w:t xml:space="preserve">Figure 1 · Valuation football field — four lenses, each shown bear–base–bull; the brass tick is the base case, the gold band the weighted central, the dark line spot. Only the top of the SOTP range (the autonomy-at-scale case, ~USD 560) reaches spot.</w:t>
+        <w:t xml:space="preserve">Figure 1 · Valuation football field — five lenses, each shown bear–base–bull; the brass tick is the base case, the gold band the weighted central at USD 254, the dark line spot. The autonomy-at-scale lens (~USD 560) is the only one above spot, and it carries a full 25% weight.</w:t>
       </w:r>
     </w:p>
     <w:p>
@@ -7887,7 +8122,7 @@
           <w:sz w:val="19"/>
           <w:szCs w:val="19"/>
         </w:rPr>
-        <w:t xml:space="preserve">The four lenses cluster below spot and the central sits ~59% under the price — but the honest signal is the width of the SOTP bar, not the point estimates: the operating businesses are worth ~USD 90–175 on cash flows and earnings, while the autonomy option carries the value from there to spot and beyond. The dispersion — USD 90 to USD 560 — is driven almost entirely by one input, the value of the autonomy option: on operating fundamentals the stock is expensive; on a full autonomy outcome it is cheap. None of this forecasts direction — the next sections describe a constructive, high-volatility price process — it states that, on the fundamentals, the debate is not about the operating business but about whether the autonomy bet pays off.</w:t>
+        <w:t xml:space="preserve">The operating lenses cluster at USD 90–175, the autonomy-at-scale case reaches USD 560, and weighting the option at a full quarter lands a central of USD 254 — about 40% below spot. The honest signal is the width of the field, not the point estimate: the dispersion — USD 90 to USD 560 — is driven almost entirely by one input, the value of the autonomy option. On operating fundamentals the stock is expensive; on a full autonomy outcome it is cheap; the central sits where it does because we give the autonomy case genuine, but not decisive, weight. None of this forecasts direction — the next sections describe a constructive, high-volatility price process — it states that, on the fundamentals, the debate is not about the operating business but about how much the autonomy bet is worth.</w:t>
       </w:r>
     </w:p>
     <w:p>
@@ -9884,7 +10119,7 @@
           <w:sz w:val="19"/>
           <w:szCs w:val="19"/>
         </w:rPr>
-        <w:t xml:space="preserve">This models the price over the next three months, not value. We simulate 50,000 paths (seed 42) from a 16-factor structure — seven continuous drivers and nine discrete event risks — calibrated to Tesla's own realized volatility. It answers “where could the price plausibly be, and with what probability”, not “what is Tesla worth”. The paths diffuse from spot as a near-term price process and deliberately do not embed the fundamental value gap — the ~59% gap of Section 1 is kept out of the drift, so the fundamental and probabilistic lenses stay independent.</w:t>
+        <w:t xml:space="preserve">This models the price over the next three months, not value. We simulate 50,000 paths (seed 42) from a 16-factor structure — seven continuous drivers and nine discrete event risks — calibrated to Tesla's own realized volatility. It answers “where could the price plausibly be, and with what probability”, not “what is Tesla worth”. The paths diffuse from spot as a near-term price process and deliberately do not embed the fundamental value gap — the ~40% gap of Section 1 is kept out of the drift, so the fundamental and probabilistic lenses stay independent.</w:t>
       </w:r>
     </w:p>
     <w:p>
@@ -10552,7 +10787,7 @@
           <w:sz w:val="16"/>
           <w:szCs w:val="16"/>
         </w:rPr>
-        <w:t xml:space="preserve">Figure 4 · Three-month forward price cone — median tracks spot; the gold dotted line marks the USD 174 fundamental central, deliberately below the cone.</w:t>
+        <w:t xml:space="preserve">Figure 4 · Three-month forward price cone — median tracks spot; the gold dotted line marks the USD 254 fundamental central, deliberately below the cone.</w:t>
       </w:r>
     </w:p>
     <w:p>
@@ -12467,7 +12702,7 @@
                 <w:sz w:val="17"/>
                 <w:szCs w:val="17"/>
               </w:rPr>
-              <w:t xml:space="preserve">USD 150</w:t>
+              <w:t xml:space="preserve">USD 130</w:t>
             </w:r>
           </w:p>
         </w:tc>
@@ -12496,7 +12731,7 @@
                 <w:sz w:val="17"/>
                 <w:szCs w:val="17"/>
               </w:rPr>
-              <w:t xml:space="preserve">−64%</w:t>
+              <w:t xml:space="preserve">−69%</w:t>
             </w:r>
           </w:p>
         </w:tc>
@@ -12585,7 +12820,7 @@
                 <w:sz w:val="17"/>
                 <w:szCs w:val="17"/>
               </w:rPr>
-              <w:t xml:space="preserve">USD 174</w:t>
+              <w:t xml:space="preserve">USD 254</w:t>
             </w:r>
           </w:p>
         </w:tc>
@@ -12613,7 +12848,7 @@
                 <w:sz w:val="17"/>
                 <w:szCs w:val="17"/>
               </w:rPr>
-              <w:t xml:space="preserve">−59%</w:t>
+              <w:t xml:space="preserve">−40%</w:t>
             </w:r>
           </w:p>
         </w:tc>
@@ -12877,7 +13112,7 @@
           <w:sz w:val="19"/>
           <w:szCs w:val="19"/>
         </w:rPr>
-        <w:t xml:space="preserve">The fundamental lenses agree that USD 420.60 is well above the value of the operating businesses: the central estimate is USD 174 (−59%), and every operating lens sits below spot. The SOTP anchor, which separates the operating pieces from the option, values the businesses at ~USD 127 and credits a risk-weighted option to reach USD 230; the cash-flow cross-check, which ignores the option entirely, is the most conservative at USD 90. The technical trend is constructive — the shares have recovered above their moving averages — and the three-month price map is wide and roughly centred on spot. A buyer at this level is not buying a discount to value, but is underwriting one proposition: that unsupervised autonomy arrives, that Robotaxi and Optimus become large, high-margin businesses, and that the operating businesses fund the wait. If the option monetizes, the autonomy-at-scale case at USD 560 is reachable; if it slips or disappoints, there is no cash-flow floor near the price and the downside to the operating value is large. This study expresses a valuation, not a trade, and certainly not advice.</w:t>
+        <w:t xml:space="preserve">The fundamental lenses agree that USD 420.60 is well above the value of the operating businesses: the central estimate is USD 254 (−40%), and every operating lens sits below spot while the autonomy-at-scale case sits above it. The SOTP anchor, which separates the operating pieces from the option, values the businesses at ~USD 127 and credits a risk-weighted option to reach USD 230; the cash-flow cross-check, which ignores the option entirely, is the most conservative at USD 90. The technical trend is constructive — the shares have recovered above their moving averages — and the three-month price map is wide and roughly centred on spot. A buyer at this level is not buying a discount to value, but is underwriting one proposition: that unsupervised autonomy arrives, that Robotaxi and Optimus become large, high-margin businesses, and that the operating businesses fund the wait. If the option monetizes, the autonomy-at-scale case at USD 560 is reachable; if it slips or disappoints, there is no cash-flow floor near the price and the downside to the operating value is large. This study expresses a valuation, not a trade, and certainly not advice.</w:t>
       </w:r>
     </w:p>
     <w:p>
@@ -24050,7 +24285,7 @@
           <w:sz w:val="19"/>
           <w:szCs w:val="19"/>
         </w:rPr>
-        <w:t xml:space="preserve">Every Testahil study closes with a panel of standing expert personas — drawn from the house Expert Persona Library, not invented for the occasion, so that each accumulates a track record across studies and a quarterly update is a re-run, not a re-training. For Tesla — a capital-heavy operating company carrying a very large technology option — we cast the three whose methods both fit an operating-company-plus-option and genuinely disagree: Expert 1 (segment sum-of-the-parts and the autonomy option), Expert 2 (normalized earnings power and relative multiples), and Expert 3 (cash returns — DCF and return on capital versus its cost). Each runs a different method, derives its fair value from shown workings, and states a falsification condition. The macro-policy lens — autonomy regulation, EV-credits and tariffs, rates and China — runs through the body (§1.8, §5) rather than as a separate persona.</w:t>
+        <w:t xml:space="preserve">Every Testahil study closes with a panel of standing expert personas — drawn from the house Expert Persona Library, not invented for the occasion, so that each accumulates a track record across studies and a quarterly update is a re-run, not a re-training. For Tesla — a capital-heavy operating company carrying a very large technology option — we cast the three whose methods both fit an operating-company-plus-option and genuinely disagree about the one thing that matters: how to value the autonomy option. Expert 1 prices only the operating cash (cash-returns — DCF and return on capital versus its cost); Expert 2 marks the segments and adds a risk-weighted option (sum-of-the-parts); Expert 3 prices the option directly by probability-weighting a scenario tree (macro-policy real-options). Their fair values run from far below spot to within striking distance of it — the honest shape of the debate. Each derives its fair value from shown workings and states a falsification condition.</w:t>
       </w:r>
     </w:p>
     <w:p>
@@ -24067,7 +24302,7 @@
           <w:sz w:val="22"/>
           <w:szCs w:val="22"/>
         </w:rPr>
-        <w:t xml:space="preserve">D.1  Expert 1 — sum-of-the-parts and the autonomy option</w:t>
+        <w:t xml:space="preserve">D.1  Expert 1 — cash returns: DCF and ROIC versus the cost of capital</w:t>
       </w:r>
     </w:p>
     <w:p>
@@ -24090,7 +24325,665 @@
           <w:sz w:val="19"/>
           <w:szCs w:val="19"/>
         </w:rPr>
-        <w:t xml:space="preserve">An operating company that houses distinct businesses plus a large option is worth the sum of its parts at realizable value, with the option priced separately and explicitly. Expert 1 marks each operating segment to what it would fetch on its own economics, then adds a probability-weighted value for the autonomy bucket rather than folding it into a multiple. </w:t>
+        <w:t xml:space="preserve">A business creates value only when each unit of capital earns above its cost. Cash, not booked profit, is the test; Expert 1 looks past the income statement to free cash flow and to the economic-profit spread of ROIC over WACC. </w:t>
+      </w:r>
+      <w:r>
+        <w:rPr>
+          <w:rFonts w:ascii="Calibri" w:cs="Calibri" w:eastAsia="Calibri" w:hAnsi="Calibri"/>
+          <w:b/>
+          <w:bCs/>
+          <w:sz w:val="19"/>
+          <w:szCs w:val="19"/>
+        </w:rPr>
+        <w:t xml:space="preserve">When it works / when it fails. </w:t>
+      </w:r>
+      <w:r>
+        <w:rPr>
+          <w:rFonts w:ascii="Calibri" w:cs="Calibri" w:eastAsia="Calibri" w:hAnsi="Calibri"/>
+          <w:sz w:val="19"/>
+          <w:szCs w:val="19"/>
+        </w:rPr>
+        <w:t xml:space="preserve">Best for capital-intensive businesses where returns on capital are the crux — Tesla's gigafactories and the USD 25bn+ capex programme make him essential — but a DCF is fragile for asset-light, optionality-driven value, so he brackets the option out and prices only the operating engine, which is his deliberate limitation.</w:t>
+      </w:r>
+    </w:p>
+    <w:p>
+      <w:pPr>
+        <w:spacing w:after="120" w:line="264"/>
+      </w:pPr>
+      <w:r>
+        <w:rPr>
+          <w:rFonts w:ascii="Calibri" w:cs="Calibri" w:eastAsia="Calibri" w:hAnsi="Calibri"/>
+          <w:b/>
+          <w:bCs/>
+          <w:sz w:val="19"/>
+          <w:szCs w:val="19"/>
+        </w:rPr>
+        <w:t xml:space="preserve">Standard workings. </w:t>
+      </w:r>
+      <w:r>
+        <w:rPr>
+          <w:rFonts w:ascii="Calibri" w:cs="Calibri" w:eastAsia="Calibri" w:hAnsi="Calibri"/>
+          <w:sz w:val="19"/>
+          <w:szCs w:val="19"/>
+        </w:rPr>
+        <w:t xml:space="preserve">(1) build free cash flow (NOPAT + D&amp;A − capex − ΔNWC); (2) compute ROIC against WACC; (3) discount the explicit stream plus a terminal value with returns fading toward the cost of capital; (4) sensitivity on WACC and the ROIC-fade.</w:t>
+      </w:r>
+    </w:p>
+    <w:tbl>
+      <w:tblPr>
+        <w:tblW w:type="dxa" w:w="7660"/>
+        <w:tblBorders>
+          <w:top w:val="single" w:color="CCCCCC" w:sz="2"/>
+          <w:left w:val="none"/>
+          <w:bottom w:val="single" w:color="CCCCCC" w:sz="2"/>
+          <w:right w:val="none"/>
+          <w:insideH w:val="single" w:color="E3E8E8" w:sz="1"/>
+          <w:insideV w:val="none"/>
+        </w:tblBorders>
+      </w:tblPr>
+      <w:tblGrid>
+        <w:gridCol w:w="5060"/>
+        <w:gridCol w:w="2600"/>
+      </w:tblGrid>
+      <w:tr>
+        <w:trPr>
+          <w:tblHeader/>
+        </w:trPr>
+        <w:tc>
+          <w:tcPr>
+            <w:tcW w:type="dxa" w:w="5060"/>
+            <w:shd w:fill="1B5E5E" w:val="clear"/>
+            <w:tcMar>
+              <w:top w:type="dxa" w:w="40"/>
+              <w:left w:type="dxa" w:w="80"/>
+              <w:bottom w:type="dxa" w:w="40"/>
+              <w:right w:type="dxa" w:w="80"/>
+            </w:tcMar>
+          </w:tcPr>
+          <w:p>
+            <w:pPr>
+              <w:spacing w:after="0"/>
+              <w:jc w:val="left"/>
+            </w:pPr>
+            <w:r>
+              <w:rPr>
+                <w:rFonts w:ascii="Calibri" w:cs="Calibri" w:eastAsia="Calibri" w:hAnsi="Calibri"/>
+                <w:b/>
+                <w:bCs/>
+                <w:color w:val="FFFFFF"/>
+                <w:sz w:val="17"/>
+                <w:szCs w:val="17"/>
+              </w:rPr>
+              <w:t xml:space="preserve">Expert 1 — worked example</w:t>
+            </w:r>
+          </w:p>
+        </w:tc>
+        <w:tc>
+          <w:tcPr>
+            <w:tcW w:type="dxa" w:w="2600"/>
+            <w:shd w:fill="1B5E5E" w:val="clear"/>
+            <w:tcMar>
+              <w:top w:type="dxa" w:w="40"/>
+              <w:left w:type="dxa" w:w="80"/>
+              <w:bottom w:type="dxa" w:w="40"/>
+              <w:right w:type="dxa" w:w="80"/>
+            </w:tcMar>
+          </w:tcPr>
+          <w:p>
+            <w:pPr>
+              <w:spacing w:after="0"/>
+              <w:jc w:val="right"/>
+            </w:pPr>
+            <w:r>
+              <w:rPr>
+                <w:rFonts w:ascii="Calibri" w:cs="Calibri" w:eastAsia="Calibri" w:hAnsi="Calibri"/>
+                <w:b/>
+                <w:bCs/>
+                <w:color w:val="FFFFFF"/>
+                <w:sz w:val="17"/>
+                <w:szCs w:val="17"/>
+              </w:rPr>
+              <w:t xml:space="preserve">Value</w:t>
+            </w:r>
+          </w:p>
+        </w:tc>
+      </w:tr>
+      <w:tr>
+        <w:trPr>
+          <w:tblHeader w:val="false"/>
+        </w:trPr>
+        <w:tc>
+          <w:tcPr>
+            <w:tcW w:type="dxa" w:w="5060"/>
+            <w:tcMar>
+              <w:top w:type="dxa" w:w="40"/>
+              <w:left w:type="dxa" w:w="80"/>
+              <w:bottom w:type="dxa" w:w="40"/>
+              <w:right w:type="dxa" w:w="80"/>
+            </w:tcMar>
+          </w:tcPr>
+          <w:p>
+            <w:pPr>
+              <w:spacing w:after="0"/>
+              <w:jc w:val="left"/>
+            </w:pPr>
+            <w:r>
+              <w:rPr>
+                <w:rFonts w:ascii="Calibri" w:cs="Calibri" w:eastAsia="Calibri" w:hAnsi="Calibri"/>
+                <w:b w:val="false"/>
+                <w:bCs w:val="false"/>
+                <w:color w:val="222222"/>
+                <w:sz w:val="17"/>
+                <w:szCs w:val="17"/>
+              </w:rPr>
+              <w:t xml:space="preserve">Invested capital (approx.)</w:t>
+            </w:r>
+          </w:p>
+        </w:tc>
+        <w:tc>
+          <w:tcPr>
+            <w:tcW w:type="dxa" w:w="2600"/>
+            <w:tcMar>
+              <w:top w:type="dxa" w:w="40"/>
+              <w:left w:type="dxa" w:w="80"/>
+              <w:bottom w:type="dxa" w:w="40"/>
+              <w:right w:type="dxa" w:w="80"/>
+            </w:tcMar>
+          </w:tcPr>
+          <w:p>
+            <w:pPr>
+              <w:spacing w:after="0"/>
+              <w:jc w:val="right"/>
+            </w:pPr>
+            <w:r>
+              <w:rPr>
+                <w:rFonts w:ascii="Calibri" w:cs="Calibri" w:eastAsia="Calibri" w:hAnsi="Calibri"/>
+                <w:b w:val="false"/>
+                <w:bCs w:val="false"/>
+                <w:color w:val="222222"/>
+                <w:sz w:val="17"/>
+                <w:szCs w:val="17"/>
+              </w:rPr>
+              <w:t xml:space="preserve">~USD 75bn</w:t>
+            </w:r>
+          </w:p>
+        </w:tc>
+      </w:tr>
+      <w:tr>
+        <w:trPr>
+          <w:tblHeader w:val="false"/>
+        </w:trPr>
+        <w:tc>
+          <w:tcPr>
+            <w:tcW w:type="dxa" w:w="5060"/>
+            <w:shd w:fill="F3F5F5" w:val="clear"/>
+            <w:tcMar>
+              <w:top w:type="dxa" w:w="40"/>
+              <w:left w:type="dxa" w:w="80"/>
+              <w:bottom w:type="dxa" w:w="40"/>
+              <w:right w:type="dxa" w:w="80"/>
+            </w:tcMar>
+          </w:tcPr>
+          <w:p>
+            <w:pPr>
+              <w:spacing w:after="0"/>
+              <w:jc w:val="left"/>
+            </w:pPr>
+            <w:r>
+              <w:rPr>
+                <w:rFonts w:ascii="Calibri" w:cs="Calibri" w:eastAsia="Calibri" w:hAnsi="Calibri"/>
+                <w:b w:val="false"/>
+                <w:bCs w:val="false"/>
+                <w:color w:val="222222"/>
+                <w:sz w:val="17"/>
+                <w:szCs w:val="17"/>
+              </w:rPr>
+              <w:t xml:space="preserve">Trough ROIC (2025)</w:t>
+            </w:r>
+          </w:p>
+        </w:tc>
+        <w:tc>
+          <w:tcPr>
+            <w:tcW w:type="dxa" w:w="2600"/>
+            <w:shd w:fill="F3F5F5" w:val="clear"/>
+            <w:tcMar>
+              <w:top w:type="dxa" w:w="40"/>
+              <w:left w:type="dxa" w:w="80"/>
+              <w:bottom w:type="dxa" w:w="40"/>
+              <w:right w:type="dxa" w:w="80"/>
+            </w:tcMar>
+          </w:tcPr>
+          <w:p>
+            <w:pPr>
+              <w:spacing w:after="0"/>
+              <w:jc w:val="right"/>
+            </w:pPr>
+            <w:r>
+              <w:rPr>
+                <w:rFonts w:ascii="Calibri" w:cs="Calibri" w:eastAsia="Calibri" w:hAnsi="Calibri"/>
+                <w:b w:val="false"/>
+                <w:bCs w:val="false"/>
+                <w:color w:val="222222"/>
+                <w:sz w:val="17"/>
+                <w:szCs w:val="17"/>
+              </w:rPr>
+              <w:t xml:space="preserve">~5% (below WACC)</w:t>
+            </w:r>
+          </w:p>
+        </w:tc>
+      </w:tr>
+      <w:tr>
+        <w:trPr>
+          <w:tblHeader w:val="false"/>
+        </w:trPr>
+        <w:tc>
+          <w:tcPr>
+            <w:tcW w:type="dxa" w:w="5060"/>
+            <w:tcMar>
+              <w:top w:type="dxa" w:w="40"/>
+              <w:left w:type="dxa" w:w="80"/>
+              <w:bottom w:type="dxa" w:w="40"/>
+              <w:right w:type="dxa" w:w="80"/>
+            </w:tcMar>
+          </w:tcPr>
+          <w:p>
+            <w:pPr>
+              <w:spacing w:after="0"/>
+              <w:jc w:val="left"/>
+            </w:pPr>
+            <w:r>
+              <w:rPr>
+                <w:rFonts w:ascii="Calibri" w:cs="Calibri" w:eastAsia="Calibri" w:hAnsi="Calibri"/>
+                <w:b w:val="false"/>
+                <w:bCs w:val="false"/>
+                <w:color w:val="222222"/>
+                <w:sz w:val="17"/>
+                <w:szCs w:val="17"/>
+              </w:rPr>
+              <w:t xml:space="preserve">Recovering ROIC by 2030e</w:t>
+            </w:r>
+          </w:p>
+        </w:tc>
+        <w:tc>
+          <w:tcPr>
+            <w:tcW w:type="dxa" w:w="2600"/>
+            <w:tcMar>
+              <w:top w:type="dxa" w:w="40"/>
+              <w:left w:type="dxa" w:w="80"/>
+              <w:bottom w:type="dxa" w:w="40"/>
+              <w:right w:type="dxa" w:w="80"/>
+            </w:tcMar>
+          </w:tcPr>
+          <w:p>
+            <w:pPr>
+              <w:spacing w:after="0"/>
+              <w:jc w:val="right"/>
+            </w:pPr>
+            <w:r>
+              <w:rPr>
+                <w:rFonts w:ascii="Calibri" w:cs="Calibri" w:eastAsia="Calibri" w:hAnsi="Calibri"/>
+                <w:b w:val="false"/>
+                <w:bCs w:val="false"/>
+                <w:color w:val="222222"/>
+                <w:sz w:val="17"/>
+                <w:szCs w:val="17"/>
+              </w:rPr>
+              <w:t xml:space="preserve">~13%</w:t>
+            </w:r>
+          </w:p>
+        </w:tc>
+      </w:tr>
+      <w:tr>
+        <w:trPr>
+          <w:tblHeader w:val="false"/>
+        </w:trPr>
+        <w:tc>
+          <w:tcPr>
+            <w:tcW w:type="dxa" w:w="5060"/>
+            <w:shd w:fill="F3F5F5" w:val="clear"/>
+            <w:tcMar>
+              <w:top w:type="dxa" w:w="40"/>
+              <w:left w:type="dxa" w:w="80"/>
+              <w:bottom w:type="dxa" w:w="40"/>
+              <w:right w:type="dxa" w:w="80"/>
+            </w:tcMar>
+          </w:tcPr>
+          <w:p>
+            <w:pPr>
+              <w:spacing w:after="0"/>
+              <w:jc w:val="left"/>
+            </w:pPr>
+            <w:r>
+              <w:rPr>
+                <w:rFonts w:ascii="Calibri" w:cs="Calibri" w:eastAsia="Calibri" w:hAnsi="Calibri"/>
+                <w:b w:val="false"/>
+                <w:bCs w:val="false"/>
+                <w:color w:val="222222"/>
+                <w:sz w:val="17"/>
+                <w:szCs w:val="17"/>
+              </w:rPr>
+              <w:t xml:space="preserve">WACC</w:t>
+            </w:r>
+          </w:p>
+        </w:tc>
+        <w:tc>
+          <w:tcPr>
+            <w:tcW w:type="dxa" w:w="2600"/>
+            <w:shd w:fill="F3F5F5" w:val="clear"/>
+            <w:tcMar>
+              <w:top w:type="dxa" w:w="40"/>
+              <w:left w:type="dxa" w:w="80"/>
+              <w:bottom w:type="dxa" w:w="40"/>
+              <w:right w:type="dxa" w:w="80"/>
+            </w:tcMar>
+          </w:tcPr>
+          <w:p>
+            <w:pPr>
+              <w:spacing w:after="0"/>
+              <w:jc w:val="right"/>
+            </w:pPr>
+            <w:r>
+              <w:rPr>
+                <w:rFonts w:ascii="Calibri" w:cs="Calibri" w:eastAsia="Calibri" w:hAnsi="Calibri"/>
+                <w:b w:val="false"/>
+                <w:bCs w:val="false"/>
+                <w:color w:val="222222"/>
+                <w:sz w:val="17"/>
+                <w:szCs w:val="17"/>
+              </w:rPr>
+              <w:t xml:space="preserve">10.0%</w:t>
+            </w:r>
+          </w:p>
+        </w:tc>
+      </w:tr>
+      <w:tr>
+        <w:trPr>
+          <w:tblHeader w:val="false"/>
+        </w:trPr>
+        <w:tc>
+          <w:tcPr>
+            <w:tcW w:type="dxa" w:w="5060"/>
+            <w:tcMar>
+              <w:top w:type="dxa" w:w="40"/>
+              <w:left w:type="dxa" w:w="80"/>
+              <w:bottom w:type="dxa" w:w="40"/>
+              <w:right w:type="dxa" w:w="80"/>
+            </w:tcMar>
+          </w:tcPr>
+          <w:p>
+            <w:pPr>
+              <w:spacing w:after="0"/>
+              <w:jc w:val="left"/>
+            </w:pPr>
+            <w:r>
+              <w:rPr>
+                <w:rFonts w:ascii="Calibri" w:cs="Calibri" w:eastAsia="Calibri" w:hAnsi="Calibri"/>
+                <w:b w:val="false"/>
+                <w:bCs w:val="false"/>
+                <w:color w:val="222222"/>
+                <w:sz w:val="17"/>
+                <w:szCs w:val="17"/>
+              </w:rPr>
+              <w:t xml:space="preserve">Terminal FCFF (2030e)</w:t>
+            </w:r>
+          </w:p>
+        </w:tc>
+        <w:tc>
+          <w:tcPr>
+            <w:tcW w:type="dxa" w:w="2600"/>
+            <w:tcMar>
+              <w:top w:type="dxa" w:w="40"/>
+              <w:left w:type="dxa" w:w="80"/>
+              <w:bottom w:type="dxa" w:w="40"/>
+              <w:right w:type="dxa" w:w="80"/>
+            </w:tcMar>
+          </w:tcPr>
+          <w:p>
+            <w:pPr>
+              <w:spacing w:after="0"/>
+              <w:jc w:val="right"/>
+            </w:pPr>
+            <w:r>
+              <w:rPr>
+                <w:rFonts w:ascii="Calibri" w:cs="Calibri" w:eastAsia="Calibri" w:hAnsi="Calibri"/>
+                <w:b w:val="false"/>
+                <w:bCs w:val="false"/>
+                <w:color w:val="222222"/>
+                <w:sz w:val="17"/>
+                <w:szCs w:val="17"/>
+              </w:rPr>
+              <w:t xml:space="preserve">~USD 21bn</w:t>
+            </w:r>
+          </w:p>
+        </w:tc>
+      </w:tr>
+      <w:tr>
+        <w:trPr>
+          <w:tblHeader w:val="false"/>
+        </w:trPr>
+        <w:tc>
+          <w:tcPr>
+            <w:tcW w:type="dxa" w:w="5060"/>
+            <w:shd w:fill="F3F5F5" w:val="clear"/>
+            <w:tcMar>
+              <w:top w:type="dxa" w:w="40"/>
+              <w:left w:type="dxa" w:w="80"/>
+              <w:bottom w:type="dxa" w:w="40"/>
+              <w:right w:type="dxa" w:w="80"/>
+            </w:tcMar>
+          </w:tcPr>
+          <w:p>
+            <w:pPr>
+              <w:spacing w:after="0"/>
+              <w:jc w:val="left"/>
+            </w:pPr>
+            <w:r>
+              <w:rPr>
+                <w:rFonts w:ascii="Calibri" w:cs="Calibri" w:eastAsia="Calibri" w:hAnsi="Calibri"/>
+                <w:b w:val="false"/>
+                <w:bCs w:val="false"/>
+                <w:color w:val="222222"/>
+                <w:sz w:val="17"/>
+                <w:szCs w:val="17"/>
+              </w:rPr>
+              <w:t xml:space="preserve">Terminal growth</w:t>
+            </w:r>
+          </w:p>
+        </w:tc>
+        <w:tc>
+          <w:tcPr>
+            <w:tcW w:type="dxa" w:w="2600"/>
+            <w:shd w:fill="F3F5F5" w:val="clear"/>
+            <w:tcMar>
+              <w:top w:type="dxa" w:w="40"/>
+              <w:left w:type="dxa" w:w="80"/>
+              <w:bottom w:type="dxa" w:w="40"/>
+              <w:right w:type="dxa" w:w="80"/>
+            </w:tcMar>
+          </w:tcPr>
+          <w:p>
+            <w:pPr>
+              <w:spacing w:after="0"/>
+              <w:jc w:val="right"/>
+            </w:pPr>
+            <w:r>
+              <w:rPr>
+                <w:rFonts w:ascii="Calibri" w:cs="Calibri" w:eastAsia="Calibri" w:hAnsi="Calibri"/>
+                <w:b w:val="false"/>
+                <w:bCs w:val="false"/>
+                <w:color w:val="222222"/>
+                <w:sz w:val="17"/>
+                <w:szCs w:val="17"/>
+              </w:rPr>
+              <w:t xml:space="preserve">4.5%</w:t>
+            </w:r>
+          </w:p>
+        </w:tc>
+      </w:tr>
+      <w:tr>
+        <w:trPr>
+          <w:tblHeader w:val="false"/>
+        </w:trPr>
+        <w:tc>
+          <w:tcPr>
+            <w:tcW w:type="dxa" w:w="5060"/>
+            <w:tcMar>
+              <w:top w:type="dxa" w:w="40"/>
+              <w:left w:type="dxa" w:w="80"/>
+              <w:bottom w:type="dxa" w:w="40"/>
+              <w:right w:type="dxa" w:w="80"/>
+            </w:tcMar>
+          </w:tcPr>
+          <w:p>
+            <w:pPr>
+              <w:spacing w:after="0"/>
+              <w:jc w:val="left"/>
+            </w:pPr>
+            <w:r>
+              <w:rPr>
+                <w:rFonts w:ascii="Calibri" w:cs="Calibri" w:eastAsia="Calibri" w:hAnsi="Calibri"/>
+                <w:b/>
+                <w:bCs/>
+                <w:color w:val="222222"/>
+                <w:sz w:val="17"/>
+                <w:szCs w:val="17"/>
+              </w:rPr>
+              <w:t xml:space="preserve">Expert 1 fair value (operating only)</w:t>
+            </w:r>
+          </w:p>
+        </w:tc>
+        <w:tc>
+          <w:tcPr>
+            <w:tcW w:type="dxa" w:w="2600"/>
+            <w:tcMar>
+              <w:top w:type="dxa" w:w="40"/>
+              <w:left w:type="dxa" w:w="80"/>
+              <w:bottom w:type="dxa" w:w="40"/>
+              <w:right w:type="dxa" w:w="80"/>
+            </w:tcMar>
+          </w:tcPr>
+          <w:p>
+            <w:pPr>
+              <w:spacing w:after="0"/>
+              <w:jc w:val="right"/>
+            </w:pPr>
+            <w:r>
+              <w:rPr>
+                <w:rFonts w:ascii="Calibri" w:cs="Calibri" w:eastAsia="Calibri" w:hAnsi="Calibri"/>
+                <w:b/>
+                <w:bCs/>
+                <w:color w:val="222222"/>
+                <w:sz w:val="17"/>
+                <w:szCs w:val="17"/>
+              </w:rPr>
+              <w:t xml:space="preserve">USD ~105</w:t>
+            </w:r>
+          </w:p>
+        </w:tc>
+      </w:tr>
+    </w:tbl>
+    <w:p>
+      <w:pPr>
+        <w:spacing w:after="120" w:line="264"/>
+      </w:pPr>
+      <w:r>
+        <w:rPr>
+          <w:rFonts w:ascii="Calibri" w:cs="Calibri" w:eastAsia="Calibri" w:hAnsi="Calibri"/>
+          <w:b/>
+          <w:bCs/>
+          <w:sz w:val="19"/>
+          <w:szCs w:val="19"/>
+        </w:rPr>
+        <w:t xml:space="preserve">Sensitivity (swing = WACC / ROIC-fade). </w:t>
+      </w:r>
+      <w:r>
+        <w:rPr>
+          <w:rFonts w:ascii="Calibri" w:cs="Calibri" w:eastAsia="Calibri" w:hAnsi="Calibri"/>
+          <w:sz w:val="19"/>
+          <w:szCs w:val="19"/>
+        </w:rPr>
+        <w:t xml:space="preserve">At an 8.5% WACC he reaches ~USD 145; at 10.0%, ~USD 105; at 11.5% — a rate truer to the stock's beta — ~USD 75. The single most important number is the discount rate applied to a value that is almost entirely terminal.</w:t>
+      </w:r>
+    </w:p>
+    <w:p>
+      <w:pPr>
+        <w:spacing w:after="120" w:line="264"/>
+      </w:pPr>
+      <w:r>
+        <w:rPr>
+          <w:rFonts w:ascii="Calibri" w:cs="Calibri" w:eastAsia="Calibri" w:hAnsi="Calibri"/>
+          <w:b/>
+          <w:bCs/>
+          <w:sz w:val="19"/>
+          <w:szCs w:val="19"/>
+        </w:rPr>
+        <w:t xml:space="preserve">Cross-examination. </w:t>
+      </w:r>
+      <w:r>
+        <w:rPr>
+          <w:rFonts w:ascii="Calibri" w:cs="Calibri" w:eastAsia="Calibri" w:hAnsi="Calibri"/>
+          <w:sz w:val="19"/>
+          <w:szCs w:val="19"/>
+        </w:rPr>
+        <w:t xml:space="preserve">He tells Expert 2 that marking a probability-weighted option is fine arithmetic, but until that option produces cash it earns no return on the ~USD 25bn a year being poured into it — the capex programme is destroying near-term economic profit. He tells Expert 3 that a scenario tree is a spreadsheet of hopes: a probability you cannot observe is not a valuation input, and cash is the only honest test. </w:t>
+      </w:r>
+      <w:r>
+        <w:rPr>
+          <w:rFonts w:ascii="Calibri" w:cs="Calibri" w:eastAsia="Calibri" w:hAnsi="Calibri"/>
+          <w:b/>
+          <w:bCs/>
+          <w:sz w:val="19"/>
+          <w:szCs w:val="19"/>
+        </w:rPr>
+        <w:t xml:space="preserve">Verdict, falsification, market-implied. </w:t>
+      </w:r>
+      <w:r>
+        <w:rPr>
+          <w:rFonts w:ascii="Calibri" w:cs="Calibri" w:eastAsia="Calibri" w:hAnsi="Calibri"/>
+          <w:sz w:val="19"/>
+          <w:szCs w:val="19"/>
+        </w:rPr>
+        <w:t xml:space="preserve">Fair ~USD 105 (range USD 75–150), operating business only — the most cautious of the three, with no margin of safety. Falsified by a durable step-up in ROIC above WACC (a genuine autonomy-software moat at high incremental margin). The market price implies terminal free cash flow several times his estimate.</w:t>
+      </w:r>
+    </w:p>
+    <w:p>
+      <w:pPr>
+        <w:pStyle w:val="Heading2"/>
+        <w:spacing w:after="120" w:before="240"/>
+      </w:pPr>
+      <w:r>
+        <w:rPr>
+          <w:rFonts w:ascii="Calibri" w:cs="Calibri" w:eastAsia="Calibri" w:hAnsi="Calibri"/>
+          <w:b/>
+          <w:bCs/>
+          <w:color w:val="1B5E5E"/>
+          <w:sz w:val="22"/>
+          <w:szCs w:val="22"/>
+        </w:rPr>
+        <w:t xml:space="preserve">D.2  Expert 2 — sum-of-the-parts and the autonomy option</w:t>
+      </w:r>
+    </w:p>
+    <w:p>
+      <w:pPr>
+        <w:spacing w:after="120" w:line="264"/>
+      </w:pPr>
+      <w:r>
+        <w:rPr>
+          <w:rFonts w:ascii="Calibri" w:cs="Calibri" w:eastAsia="Calibri" w:hAnsi="Calibri"/>
+          <w:b/>
+          <w:bCs/>
+          <w:sz w:val="19"/>
+          <w:szCs w:val="19"/>
+        </w:rPr>
+        <w:t xml:space="preserve">Worldview. </w:t>
+      </w:r>
+      <w:r>
+        <w:rPr>
+          <w:rFonts w:ascii="Calibri" w:cs="Calibri" w:eastAsia="Calibri" w:hAnsi="Calibri"/>
+          <w:sz w:val="19"/>
+          <w:szCs w:val="19"/>
+        </w:rPr>
+        <w:t xml:space="preserve">An operating company that houses distinct businesses plus a large option is worth the sum of its parts at realizable value, with the option priced separately and explicitly. Expert 2 marks each operating segment to what it would fetch on its own economics, then adds a probability-weighted value for the autonomy bucket rather than folding it into a multiple. </w:t>
       </w:r>
       <w:r>
         <w:rPr>
@@ -24179,7 +25072,7 @@
                 <w:sz w:val="17"/>
                 <w:szCs w:val="17"/>
               </w:rPr>
-              <w:t xml:space="preserve">Expert 1 — worked example</w:t>
+              <w:t xml:space="preserve">Expert 2 — worked example</w:t>
             </w:r>
           </w:p>
         </w:tc>
@@ -24737,7 +25630,7 @@
                 <w:sz w:val="17"/>
                 <w:szCs w:val="17"/>
               </w:rPr>
-              <w:t xml:space="preserve">Expert 1 fair value</w:t>
+              <w:t xml:space="preserve">Expert 2 fair value</w:t>
             </w:r>
           </w:p>
         </w:tc>
@@ -24814,7 +25707,7 @@
           <w:sz w:val="19"/>
           <w:szCs w:val="19"/>
         </w:rPr>
-        <w:t xml:space="preserve">He tells Expert 2 that a normalized P/E on today's earnings simply omits the option that is the whole point — 'you are valuing the wrapper and ignoring the prize.' He tells Expert 3 that a single group DCF blurs an auto business, an energy business and an option that deserve different discount rates and cannot be one cash-flow stream. </w:t>
+        <w:t xml:space="preserve">He tells Expert 1 that a pure operating DCF is valuing the wrapper and ignoring the prize — the autonomy option is the whole point, and a cash-flow model brackets it out by construction. He tells Expert 3 that a full four-branch tree over-reaches: better to mark the operating parts with confidence and attach a single, honest probability to the option than to invent probabilities for four different worlds. </w:t>
       </w:r>
       <w:r>
         <w:rPr>
@@ -24832,7 +25725,7 @@
           <w:sz w:val="19"/>
           <w:szCs w:val="19"/>
         </w:rPr>
-        <w:t xml:space="preserve">Fair ~USD 230 (range USD 110–560) — the anchor and the most generous of the three at base. Falsified if a segment mark proves illusory, or above all if the autonomy option cannot be monetized near the value assumed. The market price implies a ~70% weight on the full autonomy outcome, far above his 24%.</w:t>
+        <w:t xml:space="preserve">Fair ~USD 230 (range USD 110–560) — the middle of the three at base. Falsified if a segment mark proves illusory, or above all if the autonomy option cannot be monetized near the value assumed. The market price implies a ~70% weight on the full autonomy outcome, far above his ~24%.</w:t>
       </w:r>
     </w:p>
     <w:p>
@@ -24849,7 +25742,7 @@
           <w:sz w:val="22"/>
           <w:szCs w:val="22"/>
         </w:rPr>
-        <w:t xml:space="preserve">D.2  Expert 2 — normalized earnings power and relative multiples</w:t>
+        <w:t xml:space="preserve">D.3  Expert 3 — scenario real-options: probability-weighting the autonomy tree</w:t>
       </w:r>
     </w:p>
     <w:p>
@@ -24872,7 +25765,7 @@
           <w:sz w:val="19"/>
           <w:szCs w:val="19"/>
         </w:rPr>
-        <w:t xml:space="preserve">An operating business is worth a fair multiple of its sustainable, mid-cycle earnings; peaks and troughs are noise to be stripped out, and the market's own multiples on comparable businesses are the discipline. </w:t>
+        <w:t xml:space="preserve">Where value turns on a binary, high-payoff outcome that has not yet happened, the right tool is a probability-weighted tree of the worlds that could arrive, not a single point estimate. Expert 3 prices Tesla as a set of options on which world materialises — autonomy scales, autonomy partially works, autonomy stalls, or a shock hits — and weights them. He is the only one of the three who values the option directly rather than bracketing it out or attaching one number to it. </w:t>
       </w:r>
       <w:r>
         <w:rPr>
@@ -24890,7 +25783,7 @@
           <w:sz w:val="19"/>
           <w:szCs w:val="19"/>
         </w:rPr>
-        <w:t xml:space="preserve">Best for operating businesses with a record and in relative-value contexts; it fails at structural breaks and where value rests on assets or options outside current earnings — which is precisely Tesla's difficulty, so he prices only the operating engine and is explicit that he excludes the option.</w:t>
+        <w:t xml:space="preserve">Best where binary catalysts and regimes in flux dominate value — Tesla's defining condition — and it fails through false precision, because the branch probabilities are judgments and a tree can miss the branch that actually grows. He is candid that his answer is only as good as his weights.</w:t>
       </w:r>
     </w:p>
     <w:p>
@@ -24913,12 +25806,12 @@
           <w:sz w:val="19"/>
           <w:szCs w:val="19"/>
         </w:rPr>
-        <w:t xml:space="preserve">(1) normalize revenue and margins to mid-cycle; (2) derive sustainable earnings and EPS; (3) apply a justified P/E against history and peers; (4) cross-check with EV/EBITDA and EV/Sales; (5) blend.</w:t>
+        <w:t xml:space="preserve">(1) identify the 3–5 levers that set value (autonomy approval, Robotaxi unit economics, auto margin, rates, policy); (2) define bull / base / bear / stress as configurations of those levers; (3) re-run the valuation under each so scenario values are derived, not assumed; (4) probability-weight; (5) stress the weights.</w:t>
       </w:r>
     </w:p>
     <w:tbl>
       <w:tblPr>
-        <w:tblW w:type="dxa" w:w="7660"/>
+        <w:tblW w:type="dxa" w:w="7260"/>
         <w:tblBorders>
           <w:top w:val="single" w:color="CCCCCC" w:sz="2"/>
           <w:left w:val="none"/>
@@ -24929,8 +25822,9 @@
         </w:tblBorders>
       </w:tblPr>
       <w:tblGrid>
-        <w:gridCol w:w="5060"/>
-        <w:gridCol w:w="2600"/>
+        <w:gridCol w:w="4560"/>
+        <w:gridCol w:w="1800"/>
+        <w:gridCol w:w="900"/>
       </w:tblGrid>
       <w:tr>
         <w:trPr>
@@ -24938,7 +25832,7 @@
         </w:trPr>
         <w:tc>
           <w:tcPr>
-            <w:tcW w:type="dxa" w:w="5060"/>
+            <w:tcW w:type="dxa" w:w="4560"/>
             <w:shd w:fill="1B5E5E" w:val="clear"/>
             <w:tcMar>
               <w:top w:type="dxa" w:w="40"/>
@@ -24961,13 +25855,13 @@
                 <w:sz w:val="17"/>
                 <w:szCs w:val="17"/>
               </w:rPr>
-              <w:t xml:space="preserve">Expert 2 — worked example</w:t>
-            </w:r>
-          </w:p>
-        </w:tc>
-        <w:tc>
-          <w:tcPr>
-            <w:tcW w:type="dxa" w:w="2600"/>
+              <w:t xml:space="preserve">Expert 3 — scenario tree</w:t>
+            </w:r>
+          </w:p>
+        </w:tc>
+        <w:tc>
+          <w:tcPr>
+            <w:tcW w:type="dxa" w:w="1800"/>
             <w:shd w:fill="1B5E5E" w:val="clear"/>
             <w:tcMar>
               <w:top w:type="dxa" w:w="40"/>
@@ -24990,7 +25884,36 @@
                 <w:sz w:val="17"/>
                 <w:szCs w:val="17"/>
               </w:rPr>
-              <w:t xml:space="preserve">Value</w:t>
+              <w:t xml:space="preserve">Value / sh</w:t>
+            </w:r>
+          </w:p>
+        </w:tc>
+        <w:tc>
+          <w:tcPr>
+            <w:tcW w:type="dxa" w:w="900"/>
+            <w:shd w:fill="1B5E5E" w:val="clear"/>
+            <w:tcMar>
+              <w:top w:type="dxa" w:w="40"/>
+              <w:left w:type="dxa" w:w="80"/>
+              <w:bottom w:type="dxa" w:w="40"/>
+              <w:right w:type="dxa" w:w="80"/>
+            </w:tcMar>
+          </w:tcPr>
+          <w:p>
+            <w:pPr>
+              <w:spacing w:after="0"/>
+              <w:jc w:val="right"/>
+            </w:pPr>
+            <w:r>
+              <w:rPr>
+                <w:rFonts w:ascii="Calibri" w:cs="Calibri" w:eastAsia="Calibri" w:hAnsi="Calibri"/>
+                <w:b/>
+                <w:bCs/>
+                <w:color w:val="FFFFFF"/>
+                <w:sz w:val="17"/>
+                <w:szCs w:val="17"/>
+              </w:rPr>
+              <w:t xml:space="preserve">Prob.</w:t>
             </w:r>
           </w:p>
         </w:tc>
@@ -25001,7 +25924,7 @@
         </w:trPr>
         <w:tc>
           <w:tcPr>
-            <w:tcW w:type="dxa" w:w="5060"/>
+            <w:tcW w:type="dxa" w:w="4560"/>
             <w:tcMar>
               <w:top w:type="dxa" w:w="40"/>
               <w:left w:type="dxa" w:w="80"/>
@@ -25023,35 +25946,63 @@
                 <w:sz w:val="17"/>
                 <w:szCs w:val="17"/>
               </w:rPr>
-              <w:t xml:space="preserve">Normalized revenue</w:t>
-            </w:r>
-          </w:p>
-        </w:tc>
-        <w:tc>
-          <w:tcPr>
-            <w:tcW w:type="dxa" w:w="2600"/>
-            <w:tcMar>
-              <w:top w:type="dxa" w:w="40"/>
-              <w:left w:type="dxa" w:w="80"/>
-              <w:bottom w:type="dxa" w:w="40"/>
-              <w:right w:type="dxa" w:w="80"/>
-            </w:tcMar>
-          </w:tcPr>
-          <w:p>
-            <w:pPr>
-              <w:spacing w:after="0"/>
-              <w:jc w:val="right"/>
-            </w:pPr>
-            <w:r>
-              <w:rPr>
-                <w:rFonts w:ascii="Calibri" w:cs="Calibri" w:eastAsia="Calibri" w:hAnsi="Calibri"/>
-                <w:b w:val="false"/>
-                <w:bCs w:val="false"/>
-                <w:color w:val="222222"/>
-                <w:sz w:val="17"/>
-                <w:szCs w:val="17"/>
-              </w:rPr>
-              <w:t xml:space="preserve">~USD 108bn</w:t>
+              <w:t xml:space="preserve">Autonomy scales (Robotaxi + Optimus monetize)</w:t>
+            </w:r>
+          </w:p>
+        </w:tc>
+        <w:tc>
+          <w:tcPr>
+            <w:tcW w:type="dxa" w:w="1800"/>
+            <w:tcMar>
+              <w:top w:type="dxa" w:w="40"/>
+              <w:left w:type="dxa" w:w="80"/>
+              <w:bottom w:type="dxa" w:w="40"/>
+              <w:right w:type="dxa" w:w="80"/>
+            </w:tcMar>
+          </w:tcPr>
+          <w:p>
+            <w:pPr>
+              <w:spacing w:after="0"/>
+              <w:jc w:val="right"/>
+            </w:pPr>
+            <w:r>
+              <w:rPr>
+                <w:rFonts w:ascii="Calibri" w:cs="Calibri" w:eastAsia="Calibri" w:hAnsi="Calibri"/>
+                <w:b w:val="false"/>
+                <w:bCs w:val="false"/>
+                <w:color w:val="222222"/>
+                <w:sz w:val="17"/>
+                <w:szCs w:val="17"/>
+              </w:rPr>
+              <w:t xml:space="preserve">~USD 620</w:t>
+            </w:r>
+          </w:p>
+        </w:tc>
+        <w:tc>
+          <w:tcPr>
+            <w:tcW w:type="dxa" w:w="900"/>
+            <w:tcMar>
+              <w:top w:type="dxa" w:w="40"/>
+              <w:left w:type="dxa" w:w="80"/>
+              <w:bottom w:type="dxa" w:w="40"/>
+              <w:right w:type="dxa" w:w="80"/>
+            </w:tcMar>
+          </w:tcPr>
+          <w:p>
+            <w:pPr>
+              <w:spacing w:after="0"/>
+              <w:jc w:val="right"/>
+            </w:pPr>
+            <w:r>
+              <w:rPr>
+                <w:rFonts w:ascii="Calibri" w:cs="Calibri" w:eastAsia="Calibri" w:hAnsi="Calibri"/>
+                <w:b w:val="false"/>
+                <w:bCs w:val="false"/>
+                <w:color w:val="222222"/>
+                <w:sz w:val="17"/>
+                <w:szCs w:val="17"/>
+              </w:rPr>
+              <w:t xml:space="preserve">32%</w:t>
             </w:r>
           </w:p>
         </w:tc>
@@ -25062,7 +26013,7 @@
         </w:trPr>
         <w:tc>
           <w:tcPr>
-            <w:tcW w:type="dxa" w:w="5060"/>
+            <w:tcW w:type="dxa" w:w="4560"/>
             <w:shd w:fill="F3F5F5" w:val="clear"/>
             <w:tcMar>
               <w:top w:type="dxa" w:w="40"/>
@@ -25085,36 +26036,65 @@
                 <w:sz w:val="17"/>
                 <w:szCs w:val="17"/>
               </w:rPr>
-              <w:t xml:space="preserve">Normalized net margin</w:t>
-            </w:r>
-          </w:p>
-        </w:tc>
-        <w:tc>
-          <w:tcPr>
-            <w:tcW w:type="dxa" w:w="2600"/>
-            <w:shd w:fill="F3F5F5" w:val="clear"/>
-            <w:tcMar>
-              <w:top w:type="dxa" w:w="40"/>
-              <w:left w:type="dxa" w:w="80"/>
-              <w:bottom w:type="dxa" w:w="40"/>
-              <w:right w:type="dxa" w:w="80"/>
-            </w:tcMar>
-          </w:tcPr>
-          <w:p>
-            <w:pPr>
-              <w:spacing w:after="0"/>
-              <w:jc w:val="right"/>
-            </w:pPr>
-            <w:r>
-              <w:rPr>
-                <w:rFonts w:ascii="Calibri" w:cs="Calibri" w:eastAsia="Calibri" w:hAnsi="Calibri"/>
-                <w:b w:val="false"/>
-                <w:bCs w:val="false"/>
-                <w:color w:val="222222"/>
-                <w:sz w:val="17"/>
-                <w:szCs w:val="17"/>
-              </w:rPr>
-              <w:t xml:space="preserve">~13%</w:t>
+              <w:t xml:space="preserve">Partial (FSD lifts margin; no L4 at scale)</w:t>
+            </w:r>
+          </w:p>
+        </w:tc>
+        <w:tc>
+          <w:tcPr>
+            <w:tcW w:type="dxa" w:w="1800"/>
+            <w:shd w:fill="F3F5F5" w:val="clear"/>
+            <w:tcMar>
+              <w:top w:type="dxa" w:w="40"/>
+              <w:left w:type="dxa" w:w="80"/>
+              <w:bottom w:type="dxa" w:w="40"/>
+              <w:right w:type="dxa" w:w="80"/>
+            </w:tcMar>
+          </w:tcPr>
+          <w:p>
+            <w:pPr>
+              <w:spacing w:after="0"/>
+              <w:jc w:val="right"/>
+            </w:pPr>
+            <w:r>
+              <w:rPr>
+                <w:rFonts w:ascii="Calibri" w:cs="Calibri" w:eastAsia="Calibri" w:hAnsi="Calibri"/>
+                <w:b w:val="false"/>
+                <w:bCs w:val="false"/>
+                <w:color w:val="222222"/>
+                <w:sz w:val="17"/>
+                <w:szCs w:val="17"/>
+              </w:rPr>
+              <w:t xml:space="preserve">~USD 320</w:t>
+            </w:r>
+          </w:p>
+        </w:tc>
+        <w:tc>
+          <w:tcPr>
+            <w:tcW w:type="dxa" w:w="900"/>
+            <w:shd w:fill="F3F5F5" w:val="clear"/>
+            <w:tcMar>
+              <w:top w:type="dxa" w:w="40"/>
+              <w:left w:type="dxa" w:w="80"/>
+              <w:bottom w:type="dxa" w:w="40"/>
+              <w:right w:type="dxa" w:w="80"/>
+            </w:tcMar>
+          </w:tcPr>
+          <w:p>
+            <w:pPr>
+              <w:spacing w:after="0"/>
+              <w:jc w:val="right"/>
+            </w:pPr>
+            <w:r>
+              <w:rPr>
+                <w:rFonts w:ascii="Calibri" w:cs="Calibri" w:eastAsia="Calibri" w:hAnsi="Calibri"/>
+                <w:b w:val="false"/>
+                <w:bCs w:val="false"/>
+                <w:color w:val="222222"/>
+                <w:sz w:val="17"/>
+                <w:szCs w:val="17"/>
+              </w:rPr>
+              <w:t xml:space="preserve">37%</w:t>
             </w:r>
           </w:p>
         </w:tc>
@@ -25125,7 +26105,7 @@
         </w:trPr>
         <w:tc>
           <w:tcPr>
-            <w:tcW w:type="dxa" w:w="5060"/>
+            <w:tcW w:type="dxa" w:w="4560"/>
             <w:tcMar>
               <w:top w:type="dxa" w:w="40"/>
               <w:left w:type="dxa" w:w="80"/>
@@ -25147,35 +26127,63 @@
                 <w:sz w:val="17"/>
                 <w:szCs w:val="17"/>
               </w:rPr>
-              <w:t xml:space="preserve">Sustainable net earnings</w:t>
-            </w:r>
-          </w:p>
-        </w:tc>
-        <w:tc>
-          <w:tcPr>
-            <w:tcW w:type="dxa" w:w="2600"/>
-            <w:tcMar>
-              <w:top w:type="dxa" w:w="40"/>
-              <w:left w:type="dxa" w:w="80"/>
-              <w:bottom w:type="dxa" w:w="40"/>
-              <w:right w:type="dxa" w:w="80"/>
-            </w:tcMar>
-          </w:tcPr>
-          <w:p>
-            <w:pPr>
-              <w:spacing w:after="0"/>
-              <w:jc w:val="right"/>
-            </w:pPr>
-            <w:r>
-              <w:rPr>
-                <w:rFonts w:ascii="Calibri" w:cs="Calibri" w:eastAsia="Calibri" w:hAnsi="Calibri"/>
-                <w:b w:val="false"/>
-                <w:bCs w:val="false"/>
-                <w:color w:val="222222"/>
-                <w:sz w:val="17"/>
-                <w:szCs w:val="17"/>
-              </w:rPr>
-              <w:t xml:space="preserve">~USD 14bn</w:t>
+              <w:t xml:space="preserve">Operating-only (autonomy stalls)</w:t>
+            </w:r>
+          </w:p>
+        </w:tc>
+        <w:tc>
+          <w:tcPr>
+            <w:tcW w:type="dxa" w:w="1800"/>
+            <w:tcMar>
+              <w:top w:type="dxa" w:w="40"/>
+              <w:left w:type="dxa" w:w="80"/>
+              <w:bottom w:type="dxa" w:w="40"/>
+              <w:right w:type="dxa" w:w="80"/>
+            </w:tcMar>
+          </w:tcPr>
+          <w:p>
+            <w:pPr>
+              <w:spacing w:after="0"/>
+              <w:jc w:val="right"/>
+            </w:pPr>
+            <w:r>
+              <w:rPr>
+                <w:rFonts w:ascii="Calibri" w:cs="Calibri" w:eastAsia="Calibri" w:hAnsi="Calibri"/>
+                <w:b w:val="false"/>
+                <w:bCs w:val="false"/>
+                <w:color w:val="222222"/>
+                <w:sz w:val="17"/>
+                <w:szCs w:val="17"/>
+              </w:rPr>
+              <w:t xml:space="preserve">~USD 110</w:t>
+            </w:r>
+          </w:p>
+        </w:tc>
+        <w:tc>
+          <w:tcPr>
+            <w:tcW w:type="dxa" w:w="900"/>
+            <w:tcMar>
+              <w:top w:type="dxa" w:w="40"/>
+              <w:left w:type="dxa" w:w="80"/>
+              <w:bottom w:type="dxa" w:w="40"/>
+              <w:right w:type="dxa" w:w="80"/>
+            </w:tcMar>
+          </w:tcPr>
+          <w:p>
+            <w:pPr>
+              <w:spacing w:after="0"/>
+              <w:jc w:val="right"/>
+            </w:pPr>
+            <w:r>
+              <w:rPr>
+                <w:rFonts w:ascii="Calibri" w:cs="Calibri" w:eastAsia="Calibri" w:hAnsi="Calibri"/>
+                <w:b w:val="false"/>
+                <w:bCs w:val="false"/>
+                <w:color w:val="222222"/>
+                <w:sz w:val="17"/>
+                <w:szCs w:val="17"/>
+              </w:rPr>
+              <w:t xml:space="preserve">23%</w:t>
             </w:r>
           </w:p>
         </w:tc>
@@ -25186,7 +26194,7 @@
         </w:trPr>
         <w:tc>
           <w:tcPr>
-            <w:tcW w:type="dxa" w:w="5060"/>
+            <w:tcW w:type="dxa" w:w="4560"/>
             <w:shd w:fill="F3F5F5" w:val="clear"/>
             <w:tcMar>
               <w:top w:type="dxa" w:w="40"/>
@@ -25209,36 +26217,65 @@
                 <w:sz w:val="17"/>
                 <w:szCs w:val="17"/>
               </w:rPr>
-              <w:t xml:space="preserve">Sustainable EPS</w:t>
-            </w:r>
-          </w:p>
-        </w:tc>
-        <w:tc>
-          <w:tcPr>
-            <w:tcW w:type="dxa" w:w="2600"/>
-            <w:shd w:fill="F3F5F5" w:val="clear"/>
-            <w:tcMar>
-              <w:top w:type="dxa" w:w="40"/>
-              <w:left w:type="dxa" w:w="80"/>
-              <w:bottom w:type="dxa" w:w="40"/>
-              <w:right w:type="dxa" w:w="80"/>
-            </w:tcMar>
-          </w:tcPr>
-          <w:p>
-            <w:pPr>
-              <w:spacing w:after="0"/>
-              <w:jc w:val="right"/>
-            </w:pPr>
-            <w:r>
-              <w:rPr>
-                <w:rFonts w:ascii="Calibri" w:cs="Calibri" w:eastAsia="Calibri" w:hAnsi="Calibri"/>
-                <w:b w:val="false"/>
-                <w:bCs w:val="false"/>
-                <w:color w:val="222222"/>
-                <w:sz w:val="17"/>
-                <w:szCs w:val="17"/>
-              </w:rPr>
-              <w:t xml:space="preserve">~USD 4.33</w:t>
+              <w:t xml:space="preserve">Stress (margin + policy + rate shock)</w:t>
+            </w:r>
+          </w:p>
+        </w:tc>
+        <w:tc>
+          <w:tcPr>
+            <w:tcW w:type="dxa" w:w="1800"/>
+            <w:shd w:fill="F3F5F5" w:val="clear"/>
+            <w:tcMar>
+              <w:top w:type="dxa" w:w="40"/>
+              <w:left w:type="dxa" w:w="80"/>
+              <w:bottom w:type="dxa" w:w="40"/>
+              <w:right w:type="dxa" w:w="80"/>
+            </w:tcMar>
+          </w:tcPr>
+          <w:p>
+            <w:pPr>
+              <w:spacing w:after="0"/>
+              <w:jc w:val="right"/>
+            </w:pPr>
+            <w:r>
+              <w:rPr>
+                <w:rFonts w:ascii="Calibri" w:cs="Calibri" w:eastAsia="Calibri" w:hAnsi="Calibri"/>
+                <w:b w:val="false"/>
+                <w:bCs w:val="false"/>
+                <w:color w:val="222222"/>
+                <w:sz w:val="17"/>
+                <w:szCs w:val="17"/>
+              </w:rPr>
+              <w:t xml:space="preserve">~USD 70</w:t>
+            </w:r>
+          </w:p>
+        </w:tc>
+        <w:tc>
+          <w:tcPr>
+            <w:tcW w:type="dxa" w:w="900"/>
+            <w:shd w:fill="F3F5F5" w:val="clear"/>
+            <w:tcMar>
+              <w:top w:type="dxa" w:w="40"/>
+              <w:left w:type="dxa" w:w="80"/>
+              <w:bottom w:type="dxa" w:w="40"/>
+              <w:right w:type="dxa" w:w="80"/>
+            </w:tcMar>
+          </w:tcPr>
+          <w:p>
+            <w:pPr>
+              <w:spacing w:after="0"/>
+              <w:jc w:val="right"/>
+            </w:pPr>
+            <w:r>
+              <w:rPr>
+                <w:rFonts w:ascii="Calibri" w:cs="Calibri" w:eastAsia="Calibri" w:hAnsi="Calibri"/>
+                <w:b w:val="false"/>
+                <w:bCs w:val="false"/>
+                <w:color w:val="222222"/>
+                <w:sz w:val="17"/>
+                <w:szCs w:val="17"/>
+              </w:rPr>
+              <w:t xml:space="preserve">8%</w:t>
             </w:r>
           </w:p>
         </w:tc>
@@ -25249,131 +26286,7 @@
         </w:trPr>
         <w:tc>
           <w:tcPr>
-            <w:tcW w:type="dxa" w:w="5060"/>
-            <w:tcMar>
-              <w:top w:type="dxa" w:w="40"/>
-              <w:left w:type="dxa" w:w="80"/>
-              <w:bottom w:type="dxa" w:w="40"/>
-              <w:right w:type="dxa" w:w="80"/>
-            </w:tcMar>
-          </w:tcPr>
-          <w:p>
-            <w:pPr>
-              <w:spacing w:after="0"/>
-              <w:jc w:val="left"/>
-            </w:pPr>
-            <w:r>
-              <w:rPr>
-                <w:rFonts w:ascii="Calibri" w:cs="Calibri" w:eastAsia="Calibri" w:hAnsi="Calibri"/>
-                <w:b w:val="false"/>
-                <w:bCs w:val="false"/>
-                <w:color w:val="222222"/>
-                <w:sz w:val="17"/>
-                <w:szCs w:val="17"/>
-              </w:rPr>
-              <w:t xml:space="preserve">P/E read (~35×, ex-option)</w:t>
-            </w:r>
-          </w:p>
-        </w:tc>
-        <w:tc>
-          <w:tcPr>
-            <w:tcW w:type="dxa" w:w="2600"/>
-            <w:tcMar>
-              <w:top w:type="dxa" w:w="40"/>
-              <w:left w:type="dxa" w:w="80"/>
-              <w:bottom w:type="dxa" w:w="40"/>
-              <w:right w:type="dxa" w:w="80"/>
-            </w:tcMar>
-          </w:tcPr>
-          <w:p>
-            <w:pPr>
-              <w:spacing w:after="0"/>
-              <w:jc w:val="right"/>
-            </w:pPr>
-            <w:r>
-              <w:rPr>
-                <w:rFonts w:ascii="Calibri" w:cs="Calibri" w:eastAsia="Calibri" w:hAnsi="Calibri"/>
-                <w:b w:val="false"/>
-                <w:bCs w:val="false"/>
-                <w:color w:val="222222"/>
-                <w:sz w:val="17"/>
-                <w:szCs w:val="17"/>
-              </w:rPr>
-              <w:t xml:space="preserve">~USD 150</w:t>
-            </w:r>
-          </w:p>
-        </w:tc>
-      </w:tr>
-      <w:tr>
-        <w:trPr>
-          <w:tblHeader w:val="false"/>
-        </w:trPr>
-        <w:tc>
-          <w:tcPr>
-            <w:tcW w:type="dxa" w:w="5060"/>
-            <w:shd w:fill="F3F5F5" w:val="clear"/>
-            <w:tcMar>
-              <w:top w:type="dxa" w:w="40"/>
-              <w:left w:type="dxa" w:w="80"/>
-              <w:bottom w:type="dxa" w:w="40"/>
-              <w:right w:type="dxa" w:w="80"/>
-            </w:tcMar>
-          </w:tcPr>
-          <w:p>
-            <w:pPr>
-              <w:spacing w:after="0"/>
-              <w:jc w:val="left"/>
-            </w:pPr>
-            <w:r>
-              <w:rPr>
-                <w:rFonts w:ascii="Calibri" w:cs="Calibri" w:eastAsia="Calibri" w:hAnsi="Calibri"/>
-                <w:b w:val="false"/>
-                <w:bCs w:val="false"/>
-                <w:color w:val="222222"/>
-                <w:sz w:val="17"/>
-                <w:szCs w:val="17"/>
-              </w:rPr>
-              <w:t xml:space="preserve">Relative cross-check (EV/EBITDA ~30×; EV/Sales ~5×)</w:t>
-            </w:r>
-          </w:p>
-        </w:tc>
-        <w:tc>
-          <w:tcPr>
-            <w:tcW w:type="dxa" w:w="2600"/>
-            <w:shd w:fill="F3F5F5" w:val="clear"/>
-            <w:tcMar>
-              <w:top w:type="dxa" w:w="40"/>
-              <w:left w:type="dxa" w:w="80"/>
-              <w:bottom w:type="dxa" w:w="40"/>
-              <w:right w:type="dxa" w:w="80"/>
-            </w:tcMar>
-          </w:tcPr>
-          <w:p>
-            <w:pPr>
-              <w:spacing w:after="0"/>
-              <w:jc w:val="right"/>
-            </w:pPr>
-            <w:r>
-              <w:rPr>
-                <w:rFonts w:ascii="Calibri" w:cs="Calibri" w:eastAsia="Calibri" w:hAnsi="Calibri"/>
-                <w:b w:val="false"/>
-                <w:bCs w:val="false"/>
-                <w:color w:val="222222"/>
-                <w:sz w:val="17"/>
-                <w:szCs w:val="17"/>
-              </w:rPr>
-              <w:t xml:space="preserve">~USD 180–195</w:t>
-            </w:r>
-          </w:p>
-        </w:tc>
-      </w:tr>
-      <w:tr>
-        <w:trPr>
-          <w:tblHeader w:val="false"/>
-        </w:trPr>
-        <w:tc>
-          <w:tcPr>
-            <w:tcW w:type="dxa" w:w="5060"/>
+            <w:tcW w:type="dxa" w:w="4560"/>
             <w:tcMar>
               <w:top w:type="dxa" w:w="40"/>
               <w:left w:type="dxa" w:w="80"/>
@@ -25395,13 +26308,13 @@
                 <w:sz w:val="17"/>
                 <w:szCs w:val="17"/>
               </w:rPr>
-              <w:t xml:space="preserve">Expert 2 fair value (blend)</w:t>
-            </w:r>
-          </w:p>
-        </w:tc>
-        <w:tc>
-          <w:tcPr>
-            <w:tcW w:type="dxa" w:w="2600"/>
+              <w:t xml:space="preserve">Probability-weighted fair value</w:t>
+            </w:r>
+          </w:p>
+        </w:tc>
+        <w:tc>
+          <w:tcPr>
+            <w:tcW w:type="dxa" w:w="1800"/>
             <w:tcMar>
               <w:top w:type="dxa" w:w="40"/>
               <w:left w:type="dxa" w:w="80"/>
@@ -25423,7 +26336,35 @@
                 <w:sz w:val="17"/>
                 <w:szCs w:val="17"/>
               </w:rPr>
-              <w:t xml:space="preserve">USD ~175</w:t>
+              <w:t xml:space="preserve">USD ~350</w:t>
+            </w:r>
+          </w:p>
+        </w:tc>
+        <w:tc>
+          <w:tcPr>
+            <w:tcW w:type="dxa" w:w="900"/>
+            <w:tcMar>
+              <w:top w:type="dxa" w:w="40"/>
+              <w:left w:type="dxa" w:w="80"/>
+              <w:bottom w:type="dxa" w:w="40"/>
+              <w:right w:type="dxa" w:w="80"/>
+            </w:tcMar>
+          </w:tcPr>
+          <w:p>
+            <w:pPr>
+              <w:spacing w:after="0"/>
+              <w:jc w:val="right"/>
+            </w:pPr>
+            <w:r>
+              <w:rPr>
+                <w:rFonts w:ascii="Calibri" w:cs="Calibri" w:eastAsia="Calibri" w:hAnsi="Calibri"/>
+                <w:b/>
+                <w:bCs/>
+                <w:color w:val="222222"/>
+                <w:sz w:val="17"/>
+                <w:szCs w:val="17"/>
+              </w:rPr>
+              <w:t xml:space="preserve">100%</w:t>
             </w:r>
           </w:p>
         </w:tc>
@@ -25441,7 +26382,7 @@
           <w:sz w:val="19"/>
           <w:szCs w:val="19"/>
         </w:rPr>
-        <w:t xml:space="preserve">Sensitivity (swing = the justified multiple). </w:t>
+        <w:t xml:space="preserve">Sensitivity (swing = the weight on ‘autonomy scales’). </w:t>
       </w:r>
       <w:r>
         <w:rPr>
@@ -25449,7 +26390,7 @@
           <w:sz w:val="19"/>
           <w:szCs w:val="19"/>
         </w:rPr>
-        <w:t xml:space="preserve">At ~28× on normalized earnings he is near USD 120; at ~40×, USD 175; at ~50×, USD 220. Even a rich multiple on ex-option earnings stays well below spot — the multiple cannot bridge the gap, because the earnings exclude the autonomy businesses.</w:t>
+        <w:t xml:space="preserve">His whole answer is a statement about one number. Lift the weight on the autonomy-scales branch from 32% to ~40% (and cut operating-only) and he reaches ~USD 420 — essentially spot — which tells him the market is pricing roughly a 40–45% chance of the full autonomy outcome. Cut it to 20% and he falls to ~USD 270. He does not claim to know the probability; he shows what the price implies about it.</w:t>
       </w:r>
     </w:p>
     <w:p>
@@ -25472,7 +26413,7 @@
           <w:sz w:val="19"/>
           <w:szCs w:val="19"/>
         </w:rPr>
-        <w:t xml:space="preserve">He tells Expert 1 that a probability-weighted option is 'a multiple in disguise with the discipline removed,' and that a number you cannot observe is not a valuation input. He tells Expert 3 that a DCF whose value is almost all terminal is fragile and that his own multiple, struck against real peers, is the steadier instrument. </w:t>
+        <w:t xml:space="preserve">He absorbs Expert 1 and Expert 2 as his lower branches: ‘you have both priced my bear scenarios precisely — Expert 1 is my ~USD 110 operating-only world, Expert 2 is my ~USD 230 world with a modest option — and then set the probability of the two bull branches near zero, which is itself a forecast, not conservatism. A one-in-three chance of a USD 620 world is worth ~USD 200 a share on its own.’ They reply that a probability you cannot observe is not analysis but assertion, and that a tree launders a guess through arithmetic. </w:t>
       </w:r>
       <w:r>
         <w:rPr>
@@ -25490,665 +26431,7 @@
           <w:sz w:val="19"/>
           <w:szCs w:val="19"/>
         </w:rPr>
-        <w:t xml:space="preserve">Fair ~USD 175 (range USD 120–220) — the middle of the three. Falsified by a durable structural margin re-rating up (auto plus high-margin software lifting through-cycle earnings well beyond USD 14bn). The market implies a through-cycle multiple near 60× — sensible only if the earnings base is about to multiply, i.e., if autonomy monetizes.</w:t>
-      </w:r>
-    </w:p>
-    <w:p>
-      <w:pPr>
-        <w:pStyle w:val="Heading2"/>
-        <w:spacing w:after="120" w:before="240"/>
-      </w:pPr>
-      <w:r>
-        <w:rPr>
-          <w:rFonts w:ascii="Calibri" w:cs="Calibri" w:eastAsia="Calibri" w:hAnsi="Calibri"/>
-          <w:b/>
-          <w:bCs/>
-          <w:color w:val="1B5E5E"/>
-          <w:sz w:val="22"/>
-          <w:szCs w:val="22"/>
-        </w:rPr>
-        <w:t xml:space="preserve">D.3  Expert 3 — cash returns: DCF and ROIC versus the cost of capital</w:t>
-      </w:r>
-    </w:p>
-    <w:p>
-      <w:pPr>
-        <w:spacing w:after="120" w:line="264"/>
-      </w:pPr>
-      <w:r>
-        <w:rPr>
-          <w:rFonts w:ascii="Calibri" w:cs="Calibri" w:eastAsia="Calibri" w:hAnsi="Calibri"/>
-          <w:b/>
-          <w:bCs/>
-          <w:sz w:val="19"/>
-          <w:szCs w:val="19"/>
-        </w:rPr>
-        <w:t xml:space="preserve">Worldview. </w:t>
-      </w:r>
-      <w:r>
-        <w:rPr>
-          <w:rFonts w:ascii="Calibri" w:cs="Calibri" w:eastAsia="Calibri" w:hAnsi="Calibri"/>
-          <w:sz w:val="19"/>
-          <w:szCs w:val="19"/>
-        </w:rPr>
-        <w:t xml:space="preserve">A business creates value only when each unit of capital earns above its cost. Cash, not booked profit, is the test; he looks past the income statement to free cash flow and to the economic-profit spread of ROIC over WACC. </w:t>
-      </w:r>
-      <w:r>
-        <w:rPr>
-          <w:rFonts w:ascii="Calibri" w:cs="Calibri" w:eastAsia="Calibri" w:hAnsi="Calibri"/>
-          <w:b/>
-          <w:bCs/>
-          <w:sz w:val="19"/>
-          <w:szCs w:val="19"/>
-        </w:rPr>
-        <w:t xml:space="preserve">When it works / when it fails. </w:t>
-      </w:r>
-      <w:r>
-        <w:rPr>
-          <w:rFonts w:ascii="Calibri" w:cs="Calibri" w:eastAsia="Calibri" w:hAnsi="Calibri"/>
-          <w:sz w:val="19"/>
-          <w:szCs w:val="19"/>
-        </w:rPr>
-        <w:t xml:space="preserve">Best for capital-intensive businesses where returns on capital are the crux — Tesla's gigafactories and the USD 25bn+ capex programme make him essential — but a DCF is fragile for asset-light, optionality-driven value, so he brackets the option out and prices only the operating engine, which is his deliberate limitation.</w:t>
-      </w:r>
-    </w:p>
-    <w:p>
-      <w:pPr>
-        <w:spacing w:after="120" w:line="264"/>
-      </w:pPr>
-      <w:r>
-        <w:rPr>
-          <w:rFonts w:ascii="Calibri" w:cs="Calibri" w:eastAsia="Calibri" w:hAnsi="Calibri"/>
-          <w:b/>
-          <w:bCs/>
-          <w:sz w:val="19"/>
-          <w:szCs w:val="19"/>
-        </w:rPr>
-        <w:t xml:space="preserve">Standard workings. </w:t>
-      </w:r>
-      <w:r>
-        <w:rPr>
-          <w:rFonts w:ascii="Calibri" w:cs="Calibri" w:eastAsia="Calibri" w:hAnsi="Calibri"/>
-          <w:sz w:val="19"/>
-          <w:szCs w:val="19"/>
-        </w:rPr>
-        <w:t xml:space="preserve">(1) build free cash flow (NOPAT + D&amp;A − capex − ΔNWC); (2) compute ROIC against WACC; (3) discount the explicit stream plus a terminal value with returns fading toward the cost of capital; (4) sensitivity on WACC and the ROIC-fade.</w:t>
-      </w:r>
-    </w:p>
-    <w:tbl>
-      <w:tblPr>
-        <w:tblW w:type="dxa" w:w="7660"/>
-        <w:tblBorders>
-          <w:top w:val="single" w:color="CCCCCC" w:sz="2"/>
-          <w:left w:val="none"/>
-          <w:bottom w:val="single" w:color="CCCCCC" w:sz="2"/>
-          <w:right w:val="none"/>
-          <w:insideH w:val="single" w:color="E3E8E8" w:sz="1"/>
-          <w:insideV w:val="none"/>
-        </w:tblBorders>
-      </w:tblPr>
-      <w:tblGrid>
-        <w:gridCol w:w="5060"/>
-        <w:gridCol w:w="2600"/>
-      </w:tblGrid>
-      <w:tr>
-        <w:trPr>
-          <w:tblHeader/>
-        </w:trPr>
-        <w:tc>
-          <w:tcPr>
-            <w:tcW w:type="dxa" w:w="5060"/>
-            <w:shd w:fill="1B5E5E" w:val="clear"/>
-            <w:tcMar>
-              <w:top w:type="dxa" w:w="40"/>
-              <w:left w:type="dxa" w:w="80"/>
-              <w:bottom w:type="dxa" w:w="40"/>
-              <w:right w:type="dxa" w:w="80"/>
-            </w:tcMar>
-          </w:tcPr>
-          <w:p>
-            <w:pPr>
-              <w:spacing w:after="0"/>
-              <w:jc w:val="left"/>
-            </w:pPr>
-            <w:r>
-              <w:rPr>
-                <w:rFonts w:ascii="Calibri" w:cs="Calibri" w:eastAsia="Calibri" w:hAnsi="Calibri"/>
-                <w:b/>
-                <w:bCs/>
-                <w:color w:val="FFFFFF"/>
-                <w:sz w:val="17"/>
-                <w:szCs w:val="17"/>
-              </w:rPr>
-              <w:t xml:space="preserve">Expert 3 — worked example</w:t>
-            </w:r>
-          </w:p>
-        </w:tc>
-        <w:tc>
-          <w:tcPr>
-            <w:tcW w:type="dxa" w:w="2600"/>
-            <w:shd w:fill="1B5E5E" w:val="clear"/>
-            <w:tcMar>
-              <w:top w:type="dxa" w:w="40"/>
-              <w:left w:type="dxa" w:w="80"/>
-              <w:bottom w:type="dxa" w:w="40"/>
-              <w:right w:type="dxa" w:w="80"/>
-            </w:tcMar>
-          </w:tcPr>
-          <w:p>
-            <w:pPr>
-              <w:spacing w:after="0"/>
-              <w:jc w:val="right"/>
-            </w:pPr>
-            <w:r>
-              <w:rPr>
-                <w:rFonts w:ascii="Calibri" w:cs="Calibri" w:eastAsia="Calibri" w:hAnsi="Calibri"/>
-                <w:b/>
-                <w:bCs/>
-                <w:color w:val="FFFFFF"/>
-                <w:sz w:val="17"/>
-                <w:szCs w:val="17"/>
-              </w:rPr>
-              <w:t xml:space="preserve">Value</w:t>
-            </w:r>
-          </w:p>
-        </w:tc>
-      </w:tr>
-      <w:tr>
-        <w:trPr>
-          <w:tblHeader w:val="false"/>
-        </w:trPr>
-        <w:tc>
-          <w:tcPr>
-            <w:tcW w:type="dxa" w:w="5060"/>
-            <w:tcMar>
-              <w:top w:type="dxa" w:w="40"/>
-              <w:left w:type="dxa" w:w="80"/>
-              <w:bottom w:type="dxa" w:w="40"/>
-              <w:right w:type="dxa" w:w="80"/>
-            </w:tcMar>
-          </w:tcPr>
-          <w:p>
-            <w:pPr>
-              <w:spacing w:after="0"/>
-              <w:jc w:val="left"/>
-            </w:pPr>
-            <w:r>
-              <w:rPr>
-                <w:rFonts w:ascii="Calibri" w:cs="Calibri" w:eastAsia="Calibri" w:hAnsi="Calibri"/>
-                <w:b w:val="false"/>
-                <w:bCs w:val="false"/>
-                <w:color w:val="222222"/>
-                <w:sz w:val="17"/>
-                <w:szCs w:val="17"/>
-              </w:rPr>
-              <w:t xml:space="preserve">Invested capital (approx.)</w:t>
-            </w:r>
-          </w:p>
-        </w:tc>
-        <w:tc>
-          <w:tcPr>
-            <w:tcW w:type="dxa" w:w="2600"/>
-            <w:tcMar>
-              <w:top w:type="dxa" w:w="40"/>
-              <w:left w:type="dxa" w:w="80"/>
-              <w:bottom w:type="dxa" w:w="40"/>
-              <w:right w:type="dxa" w:w="80"/>
-            </w:tcMar>
-          </w:tcPr>
-          <w:p>
-            <w:pPr>
-              <w:spacing w:after="0"/>
-              <w:jc w:val="right"/>
-            </w:pPr>
-            <w:r>
-              <w:rPr>
-                <w:rFonts w:ascii="Calibri" w:cs="Calibri" w:eastAsia="Calibri" w:hAnsi="Calibri"/>
-                <w:b w:val="false"/>
-                <w:bCs w:val="false"/>
-                <w:color w:val="222222"/>
-                <w:sz w:val="17"/>
-                <w:szCs w:val="17"/>
-              </w:rPr>
-              <w:t xml:space="preserve">~USD 75bn</w:t>
-            </w:r>
-          </w:p>
-        </w:tc>
-      </w:tr>
-      <w:tr>
-        <w:trPr>
-          <w:tblHeader w:val="false"/>
-        </w:trPr>
-        <w:tc>
-          <w:tcPr>
-            <w:tcW w:type="dxa" w:w="5060"/>
-            <w:shd w:fill="F3F5F5" w:val="clear"/>
-            <w:tcMar>
-              <w:top w:type="dxa" w:w="40"/>
-              <w:left w:type="dxa" w:w="80"/>
-              <w:bottom w:type="dxa" w:w="40"/>
-              <w:right w:type="dxa" w:w="80"/>
-            </w:tcMar>
-          </w:tcPr>
-          <w:p>
-            <w:pPr>
-              <w:spacing w:after="0"/>
-              <w:jc w:val="left"/>
-            </w:pPr>
-            <w:r>
-              <w:rPr>
-                <w:rFonts w:ascii="Calibri" w:cs="Calibri" w:eastAsia="Calibri" w:hAnsi="Calibri"/>
-                <w:b w:val="false"/>
-                <w:bCs w:val="false"/>
-                <w:color w:val="222222"/>
-                <w:sz w:val="17"/>
-                <w:szCs w:val="17"/>
-              </w:rPr>
-              <w:t xml:space="preserve">Trough ROIC (2025)</w:t>
-            </w:r>
-          </w:p>
-        </w:tc>
-        <w:tc>
-          <w:tcPr>
-            <w:tcW w:type="dxa" w:w="2600"/>
-            <w:shd w:fill="F3F5F5" w:val="clear"/>
-            <w:tcMar>
-              <w:top w:type="dxa" w:w="40"/>
-              <w:left w:type="dxa" w:w="80"/>
-              <w:bottom w:type="dxa" w:w="40"/>
-              <w:right w:type="dxa" w:w="80"/>
-            </w:tcMar>
-          </w:tcPr>
-          <w:p>
-            <w:pPr>
-              <w:spacing w:after="0"/>
-              <w:jc w:val="right"/>
-            </w:pPr>
-            <w:r>
-              <w:rPr>
-                <w:rFonts w:ascii="Calibri" w:cs="Calibri" w:eastAsia="Calibri" w:hAnsi="Calibri"/>
-                <w:b w:val="false"/>
-                <w:bCs w:val="false"/>
-                <w:color w:val="222222"/>
-                <w:sz w:val="17"/>
-                <w:szCs w:val="17"/>
-              </w:rPr>
-              <w:t xml:space="preserve">~5% (below WACC)</w:t>
-            </w:r>
-          </w:p>
-        </w:tc>
-      </w:tr>
-      <w:tr>
-        <w:trPr>
-          <w:tblHeader w:val="false"/>
-        </w:trPr>
-        <w:tc>
-          <w:tcPr>
-            <w:tcW w:type="dxa" w:w="5060"/>
-            <w:tcMar>
-              <w:top w:type="dxa" w:w="40"/>
-              <w:left w:type="dxa" w:w="80"/>
-              <w:bottom w:type="dxa" w:w="40"/>
-              <w:right w:type="dxa" w:w="80"/>
-            </w:tcMar>
-          </w:tcPr>
-          <w:p>
-            <w:pPr>
-              <w:spacing w:after="0"/>
-              <w:jc w:val="left"/>
-            </w:pPr>
-            <w:r>
-              <w:rPr>
-                <w:rFonts w:ascii="Calibri" w:cs="Calibri" w:eastAsia="Calibri" w:hAnsi="Calibri"/>
-                <w:b w:val="false"/>
-                <w:bCs w:val="false"/>
-                <w:color w:val="222222"/>
-                <w:sz w:val="17"/>
-                <w:szCs w:val="17"/>
-              </w:rPr>
-              <w:t xml:space="preserve">Recovering ROIC by 2030e</w:t>
-            </w:r>
-          </w:p>
-        </w:tc>
-        <w:tc>
-          <w:tcPr>
-            <w:tcW w:type="dxa" w:w="2600"/>
-            <w:tcMar>
-              <w:top w:type="dxa" w:w="40"/>
-              <w:left w:type="dxa" w:w="80"/>
-              <w:bottom w:type="dxa" w:w="40"/>
-              <w:right w:type="dxa" w:w="80"/>
-            </w:tcMar>
-          </w:tcPr>
-          <w:p>
-            <w:pPr>
-              <w:spacing w:after="0"/>
-              <w:jc w:val="right"/>
-            </w:pPr>
-            <w:r>
-              <w:rPr>
-                <w:rFonts w:ascii="Calibri" w:cs="Calibri" w:eastAsia="Calibri" w:hAnsi="Calibri"/>
-                <w:b w:val="false"/>
-                <w:bCs w:val="false"/>
-                <w:color w:val="222222"/>
-                <w:sz w:val="17"/>
-                <w:szCs w:val="17"/>
-              </w:rPr>
-              <w:t xml:space="preserve">~13%</w:t>
-            </w:r>
-          </w:p>
-        </w:tc>
-      </w:tr>
-      <w:tr>
-        <w:trPr>
-          <w:tblHeader w:val="false"/>
-        </w:trPr>
-        <w:tc>
-          <w:tcPr>
-            <w:tcW w:type="dxa" w:w="5060"/>
-            <w:shd w:fill="F3F5F5" w:val="clear"/>
-            <w:tcMar>
-              <w:top w:type="dxa" w:w="40"/>
-              <w:left w:type="dxa" w:w="80"/>
-              <w:bottom w:type="dxa" w:w="40"/>
-              <w:right w:type="dxa" w:w="80"/>
-            </w:tcMar>
-          </w:tcPr>
-          <w:p>
-            <w:pPr>
-              <w:spacing w:after="0"/>
-              <w:jc w:val="left"/>
-            </w:pPr>
-            <w:r>
-              <w:rPr>
-                <w:rFonts w:ascii="Calibri" w:cs="Calibri" w:eastAsia="Calibri" w:hAnsi="Calibri"/>
-                <w:b w:val="false"/>
-                <w:bCs w:val="false"/>
-                <w:color w:val="222222"/>
-                <w:sz w:val="17"/>
-                <w:szCs w:val="17"/>
-              </w:rPr>
-              <w:t xml:space="preserve">WACC</w:t>
-            </w:r>
-          </w:p>
-        </w:tc>
-        <w:tc>
-          <w:tcPr>
-            <w:tcW w:type="dxa" w:w="2600"/>
-            <w:shd w:fill="F3F5F5" w:val="clear"/>
-            <w:tcMar>
-              <w:top w:type="dxa" w:w="40"/>
-              <w:left w:type="dxa" w:w="80"/>
-              <w:bottom w:type="dxa" w:w="40"/>
-              <w:right w:type="dxa" w:w="80"/>
-            </w:tcMar>
-          </w:tcPr>
-          <w:p>
-            <w:pPr>
-              <w:spacing w:after="0"/>
-              <w:jc w:val="right"/>
-            </w:pPr>
-            <w:r>
-              <w:rPr>
-                <w:rFonts w:ascii="Calibri" w:cs="Calibri" w:eastAsia="Calibri" w:hAnsi="Calibri"/>
-                <w:b w:val="false"/>
-                <w:bCs w:val="false"/>
-                <w:color w:val="222222"/>
-                <w:sz w:val="17"/>
-                <w:szCs w:val="17"/>
-              </w:rPr>
-              <w:t xml:space="preserve">10.0%</w:t>
-            </w:r>
-          </w:p>
-        </w:tc>
-      </w:tr>
-      <w:tr>
-        <w:trPr>
-          <w:tblHeader w:val="false"/>
-        </w:trPr>
-        <w:tc>
-          <w:tcPr>
-            <w:tcW w:type="dxa" w:w="5060"/>
-            <w:tcMar>
-              <w:top w:type="dxa" w:w="40"/>
-              <w:left w:type="dxa" w:w="80"/>
-              <w:bottom w:type="dxa" w:w="40"/>
-              <w:right w:type="dxa" w:w="80"/>
-            </w:tcMar>
-          </w:tcPr>
-          <w:p>
-            <w:pPr>
-              <w:spacing w:after="0"/>
-              <w:jc w:val="left"/>
-            </w:pPr>
-            <w:r>
-              <w:rPr>
-                <w:rFonts w:ascii="Calibri" w:cs="Calibri" w:eastAsia="Calibri" w:hAnsi="Calibri"/>
-                <w:b w:val="false"/>
-                <w:bCs w:val="false"/>
-                <w:color w:val="222222"/>
-                <w:sz w:val="17"/>
-                <w:szCs w:val="17"/>
-              </w:rPr>
-              <w:t xml:space="preserve">Terminal FCFF (2030e)</w:t>
-            </w:r>
-          </w:p>
-        </w:tc>
-        <w:tc>
-          <w:tcPr>
-            <w:tcW w:type="dxa" w:w="2600"/>
-            <w:tcMar>
-              <w:top w:type="dxa" w:w="40"/>
-              <w:left w:type="dxa" w:w="80"/>
-              <w:bottom w:type="dxa" w:w="40"/>
-              <w:right w:type="dxa" w:w="80"/>
-            </w:tcMar>
-          </w:tcPr>
-          <w:p>
-            <w:pPr>
-              <w:spacing w:after="0"/>
-              <w:jc w:val="right"/>
-            </w:pPr>
-            <w:r>
-              <w:rPr>
-                <w:rFonts w:ascii="Calibri" w:cs="Calibri" w:eastAsia="Calibri" w:hAnsi="Calibri"/>
-                <w:b w:val="false"/>
-                <w:bCs w:val="false"/>
-                <w:color w:val="222222"/>
-                <w:sz w:val="17"/>
-                <w:szCs w:val="17"/>
-              </w:rPr>
-              <w:t xml:space="preserve">~USD 21bn</w:t>
-            </w:r>
-          </w:p>
-        </w:tc>
-      </w:tr>
-      <w:tr>
-        <w:trPr>
-          <w:tblHeader w:val="false"/>
-        </w:trPr>
-        <w:tc>
-          <w:tcPr>
-            <w:tcW w:type="dxa" w:w="5060"/>
-            <w:shd w:fill="F3F5F5" w:val="clear"/>
-            <w:tcMar>
-              <w:top w:type="dxa" w:w="40"/>
-              <w:left w:type="dxa" w:w="80"/>
-              <w:bottom w:type="dxa" w:w="40"/>
-              <w:right w:type="dxa" w:w="80"/>
-            </w:tcMar>
-          </w:tcPr>
-          <w:p>
-            <w:pPr>
-              <w:spacing w:after="0"/>
-              <w:jc w:val="left"/>
-            </w:pPr>
-            <w:r>
-              <w:rPr>
-                <w:rFonts w:ascii="Calibri" w:cs="Calibri" w:eastAsia="Calibri" w:hAnsi="Calibri"/>
-                <w:b w:val="false"/>
-                <w:bCs w:val="false"/>
-                <w:color w:val="222222"/>
-                <w:sz w:val="17"/>
-                <w:szCs w:val="17"/>
-              </w:rPr>
-              <w:t xml:space="preserve">Terminal growth</w:t>
-            </w:r>
-          </w:p>
-        </w:tc>
-        <w:tc>
-          <w:tcPr>
-            <w:tcW w:type="dxa" w:w="2600"/>
-            <w:shd w:fill="F3F5F5" w:val="clear"/>
-            <w:tcMar>
-              <w:top w:type="dxa" w:w="40"/>
-              <w:left w:type="dxa" w:w="80"/>
-              <w:bottom w:type="dxa" w:w="40"/>
-              <w:right w:type="dxa" w:w="80"/>
-            </w:tcMar>
-          </w:tcPr>
-          <w:p>
-            <w:pPr>
-              <w:spacing w:after="0"/>
-              <w:jc w:val="right"/>
-            </w:pPr>
-            <w:r>
-              <w:rPr>
-                <w:rFonts w:ascii="Calibri" w:cs="Calibri" w:eastAsia="Calibri" w:hAnsi="Calibri"/>
-                <w:b w:val="false"/>
-                <w:bCs w:val="false"/>
-                <w:color w:val="222222"/>
-                <w:sz w:val="17"/>
-                <w:szCs w:val="17"/>
-              </w:rPr>
-              <w:t xml:space="preserve">4.5%</w:t>
-            </w:r>
-          </w:p>
-        </w:tc>
-      </w:tr>
-      <w:tr>
-        <w:trPr>
-          <w:tblHeader w:val="false"/>
-        </w:trPr>
-        <w:tc>
-          <w:tcPr>
-            <w:tcW w:type="dxa" w:w="5060"/>
-            <w:tcMar>
-              <w:top w:type="dxa" w:w="40"/>
-              <w:left w:type="dxa" w:w="80"/>
-              <w:bottom w:type="dxa" w:w="40"/>
-              <w:right w:type="dxa" w:w="80"/>
-            </w:tcMar>
-          </w:tcPr>
-          <w:p>
-            <w:pPr>
-              <w:spacing w:after="0"/>
-              <w:jc w:val="left"/>
-            </w:pPr>
-            <w:r>
-              <w:rPr>
-                <w:rFonts w:ascii="Calibri" w:cs="Calibri" w:eastAsia="Calibri" w:hAnsi="Calibri"/>
-                <w:b/>
-                <w:bCs/>
-                <w:color w:val="222222"/>
-                <w:sz w:val="17"/>
-                <w:szCs w:val="17"/>
-              </w:rPr>
-              <w:t xml:space="preserve">Expert 3 fair value (operating only)</w:t>
-            </w:r>
-          </w:p>
-        </w:tc>
-        <w:tc>
-          <w:tcPr>
-            <w:tcW w:type="dxa" w:w="2600"/>
-            <w:tcMar>
-              <w:top w:type="dxa" w:w="40"/>
-              <w:left w:type="dxa" w:w="80"/>
-              <w:bottom w:type="dxa" w:w="40"/>
-              <w:right w:type="dxa" w:w="80"/>
-            </w:tcMar>
-          </w:tcPr>
-          <w:p>
-            <w:pPr>
-              <w:spacing w:after="0"/>
-              <w:jc w:val="right"/>
-            </w:pPr>
-            <w:r>
-              <w:rPr>
-                <w:rFonts w:ascii="Calibri" w:cs="Calibri" w:eastAsia="Calibri" w:hAnsi="Calibri"/>
-                <w:b/>
-                <w:bCs/>
-                <w:color w:val="222222"/>
-                <w:sz w:val="17"/>
-                <w:szCs w:val="17"/>
-              </w:rPr>
-              <w:t xml:space="preserve">USD ~105</w:t>
-            </w:r>
-          </w:p>
-        </w:tc>
-      </w:tr>
-    </w:tbl>
-    <w:p>
-      <w:pPr>
-        <w:spacing w:after="120" w:line="264"/>
-      </w:pPr>
-      <w:r>
-        <w:rPr>
-          <w:rFonts w:ascii="Calibri" w:cs="Calibri" w:eastAsia="Calibri" w:hAnsi="Calibri"/>
-          <w:b/>
-          <w:bCs/>
-          <w:sz w:val="19"/>
-          <w:szCs w:val="19"/>
-        </w:rPr>
-        <w:t xml:space="preserve">Sensitivity (swing = WACC / ROIC-fade). </w:t>
-      </w:r>
-      <w:r>
-        <w:rPr>
-          <w:rFonts w:ascii="Calibri" w:cs="Calibri" w:eastAsia="Calibri" w:hAnsi="Calibri"/>
-          <w:sz w:val="19"/>
-          <w:szCs w:val="19"/>
-        </w:rPr>
-        <w:t xml:space="preserve">At an 8.5% WACC he reaches ~USD 145; at 10.0%, ~USD 105; at 11.5% — a rate truer to the stock's beta — ~USD 75. The single most important number is the discount rate applied to a value that is almost entirely terminal.</w:t>
-      </w:r>
-    </w:p>
-    <w:p>
-      <w:pPr>
-        <w:spacing w:after="120" w:line="264"/>
-      </w:pPr>
-      <w:r>
-        <w:rPr>
-          <w:rFonts w:ascii="Calibri" w:cs="Calibri" w:eastAsia="Calibri" w:hAnsi="Calibri"/>
-          <w:b/>
-          <w:bCs/>
-          <w:sz w:val="19"/>
-          <w:szCs w:val="19"/>
-        </w:rPr>
-        <w:t xml:space="preserve">Cross-examination. </w:t>
-      </w:r>
-      <w:r>
-        <w:rPr>
-          <w:rFonts w:ascii="Calibri" w:cs="Calibri" w:eastAsia="Calibri" w:hAnsi="Calibri"/>
-          <w:sz w:val="19"/>
-          <w:szCs w:val="19"/>
-        </w:rPr>
-        <w:t xml:space="preserve">He agrees with Expert 2 that the operating business is worth little near spot, but insists the right tool is cash and ROIC, not a P/E. He tells Expert 1 that until the option produces cash it earns no return on the capital being poured into it, and that the capex programme is destroying near-term economic profit. </w:t>
-      </w:r>
-      <w:r>
-        <w:rPr>
-          <w:rFonts w:ascii="Calibri" w:cs="Calibri" w:eastAsia="Calibri" w:hAnsi="Calibri"/>
-          <w:b/>
-          <w:bCs/>
-          <w:sz w:val="19"/>
-          <w:szCs w:val="19"/>
-        </w:rPr>
-        <w:t xml:space="preserve">Verdict, falsification, market-implied. </w:t>
-      </w:r>
-      <w:r>
-        <w:rPr>
-          <w:rFonts w:ascii="Calibri" w:cs="Calibri" w:eastAsia="Calibri" w:hAnsi="Calibri"/>
-          <w:sz w:val="19"/>
-          <w:szCs w:val="19"/>
-        </w:rPr>
-        <w:t xml:space="preserve">Fair ~USD 105 (range USD 75–150) — the most cautious of the three: no margin of safety, operating business only. Falsified by a durable step-up in ROIC above WACC — a genuine autonomy-software moat at high incremental margin. The market price implies terminal free cash flow several times his estimate.</w:t>
+        <w:t xml:space="preserve">Probability-weighted fair ~USD 350 (−17%) — the highest of the three and the nearest to spot, yet still below it. Falsified by an unmodelled fifth branch dominating, or by the scenario set being mis-specified. The market price implies the full autonomy outcome is weighted at ~40–45%, a touch above his 32%.</w:t>
       </w:r>
     </w:p>
     <w:p>
@@ -26188,7 +26471,7 @@
           <w:sz w:val="19"/>
           <w:szCs w:val="19"/>
         </w:rPr>
-        <w:t xml:space="preserve">Expert 3: </w:t>
+        <w:t xml:space="preserve">Expert 1: </w:t>
       </w:r>
       <w:r>
         <w:rPr>
@@ -26196,7 +26479,7 @@
           <w:sz w:val="19"/>
           <w:szCs w:val="19"/>
         </w:rPr>
-        <w:t xml:space="preserve">“It is consuming roughly USD 25bn of capital a year at a return of zero. Until it earns above its cost of capital it destroys economic profit — I credit it nothing.” </w:t>
+        <w:t xml:space="preserve">“It is consuming roughly USD 25bn of capital a year at a return of zero. Until it earns above its cost of capital it destroys economic profit — I credit it nothing, and the operating business is worth about USD 105.” </w:t>
       </w:r>
       <w:r>
         <w:rPr>
@@ -26214,7 +26497,7 @@
           <w:sz w:val="19"/>
           <w:szCs w:val="19"/>
         </w:rPr>
-        <w:t xml:space="preserve">“Agreed on the cash, and on the earnings. The multiple only makes sense if the earnings base is about to multiply, and I will not pay sixty times for a hope. On today's business it is worth about USD 175.” </w:t>
+        <w:t xml:space="preserve">“That is too harsh. Mark the parts — auto, energy, services, the net cash — at about USD 127, then attach an honest one-in-four probability to a Robotaxi-and-Optimus world. That risk-weighted option is another hundred dollars a share, so about USD 230.” </w:t>
       </w:r>
       <w:r>
         <w:rPr>
@@ -26224,7 +26507,7 @@
           <w:sz w:val="19"/>
           <w:szCs w:val="19"/>
         </w:rPr>
-        <w:t xml:space="preserve">Expert 1: </w:t>
+        <w:t xml:space="preserve">Expert 3: </w:t>
       </w:r>
       <w:r>
         <w:rPr>
@@ -26232,7 +26515,7 @@
           <w:sz w:val="19"/>
           <w:szCs w:val="19"/>
         </w:rPr>
-        <w:t xml:space="preserve">“You are both pricing the wrapper and ignoring the prize. Mark the parts — auto, energy, services, the net cash — at about USD 127, then decide what a one-in-four chance of a Robotaxi-and-Optimus world is worth. That risk-weighted option is another hundred dollars a share. The argument is the probability, not the parts.” The exchange is the whole study: two anchor the operating value with discipline, one prices the option with humility about the odds, and none of the three reaches spot.</w:t>
+        <w:t xml:space="preserve">“You are both pricing my bear branches and setting the bulls to zero. A one-in-three chance of a USD 620 world is worth ~USD 200 a share by itself; weight the branches honestly and you land near USD 350 — and if the market is right that autonomy is closer to even money, you reach spot.” The exchange is the whole study: two anchor the operating value with discipline, one prices the option and lands within 17% of spot, and the spread between them is exactly the value of the autonomy bet.</w:t>
       </w:r>
     </w:p>
     <w:p>
@@ -26311,7 +26594,7 @@
           <w:sz w:val="16"/>
           <w:szCs w:val="16"/>
         </w:rPr>
-        <w:t xml:space="preserve">Figure D-1 · The three experts' fair-value ranges. Brass ticks are base cases; the gold band is the panel centre; the dark line is spot. The spread is almost entirely an autonomy-option disagreement.</w:t>
+        <w:t xml:space="preserve">Figure D-1 · The three experts' fair-value ranges. Brass ticks are base cases; the gold band is the panel centre near the USD 254 fundamental central; the dark line is spot. The spread is almost entirely an autonomy-option disagreement, and Expert 3 (scenario) reaches within ~17% of spot.</w:t>
       </w:r>
     </w:p>
     <w:tbl>
@@ -26539,7 +26822,7 @@
                 <w:sz w:val="17"/>
                 <w:szCs w:val="17"/>
               </w:rPr>
-              <w:t xml:space="preserve">Sum-of-the-parts + option</w:t>
+              <w:t xml:space="preserve">Cash returns / DCF-ROIC</w:t>
             </w:r>
           </w:p>
         </w:tc>
@@ -26567,7 +26850,7 @@
                 <w:sz w:val="17"/>
                 <w:szCs w:val="17"/>
               </w:rPr>
-              <w:t xml:space="preserve">autonomy option probability weight</w:t>
+              <w:t xml:space="preserve">WACC &amp; ROIC-fade</w:t>
             </w:r>
           </w:p>
         </w:tc>
@@ -26595,7 +26878,7 @@
                 <w:sz w:val="17"/>
                 <w:szCs w:val="17"/>
               </w:rPr>
-              <w:t xml:space="preserve">USD 230</w:t>
+              <w:t xml:space="preserve">USD 105</w:t>
             </w:r>
           </w:p>
         </w:tc>
@@ -26623,7 +26906,7 @@
                 <w:sz w:val="17"/>
                 <w:szCs w:val="17"/>
               </w:rPr>
-              <w:t xml:space="preserve">−45%</w:t>
+              <w:t xml:space="preserve">−75%</w:t>
             </w:r>
           </w:p>
         </w:tc>
@@ -26686,7 +26969,7 @@
                 <w:sz w:val="17"/>
                 <w:szCs w:val="17"/>
               </w:rPr>
-              <w:t xml:space="preserve">Normalized earnings × multiple</w:t>
+              <w:t xml:space="preserve">Sum-of-the-parts + option</w:t>
             </w:r>
           </w:p>
         </w:tc>
@@ -26715,7 +26998,7 @@
                 <w:sz w:val="17"/>
                 <w:szCs w:val="17"/>
               </w:rPr>
-              <w:t xml:space="preserve">the justified multiple</w:t>
+              <w:t xml:space="preserve">autonomy option probability weight</w:t>
             </w:r>
           </w:p>
         </w:tc>
@@ -26744,7 +27027,7 @@
                 <w:sz w:val="17"/>
                 <w:szCs w:val="17"/>
               </w:rPr>
-              <w:t xml:space="preserve">USD 175</w:t>
+              <w:t xml:space="preserve">USD 230</w:t>
             </w:r>
           </w:p>
         </w:tc>
@@ -26773,7 +27056,7 @@
                 <w:sz w:val="17"/>
                 <w:szCs w:val="17"/>
               </w:rPr>
-              <w:t xml:space="preserve">−58%</w:t>
+              <w:t xml:space="preserve">−45%</w:t>
             </w:r>
           </w:p>
         </w:tc>
@@ -26834,7 +27117,7 @@
                 <w:sz w:val="17"/>
                 <w:szCs w:val="17"/>
               </w:rPr>
-              <w:t xml:space="preserve">Cash returns / DCF-ROIC</w:t>
+              <w:t xml:space="preserve">Scenario real-options</w:t>
             </w:r>
           </w:p>
         </w:tc>
@@ -26862,7 +27145,7 @@
                 <w:sz w:val="17"/>
                 <w:szCs w:val="17"/>
               </w:rPr>
-              <w:t xml:space="preserve">WACC &amp; ROIC-fade</w:t>
+              <w:t xml:space="preserve">weight on ‘autonomy scales’</w:t>
             </w:r>
           </w:p>
         </w:tc>
@@ -26890,7 +27173,7 @@
                 <w:sz w:val="17"/>
                 <w:szCs w:val="17"/>
               </w:rPr>
-              <w:t xml:space="preserve">USD 105</w:t>
+              <w:t xml:space="preserve">USD 350</w:t>
             </w:r>
           </w:p>
         </w:tc>
@@ -26918,7 +27201,7 @@
                 <w:sz w:val="17"/>
                 <w:szCs w:val="17"/>
               </w:rPr>
-              <w:t xml:space="preserve">−75%</w:t>
+              <w:t xml:space="preserve">−17%</w:t>
             </w:r>
           </w:p>
         </w:tc>
@@ -26944,7 +27227,7 @@
           <w:sz w:val="19"/>
           <w:szCs w:val="19"/>
         </w:rPr>
-        <w:t xml:space="preserve">The USD 105-to-USD 230 spread across the three is not disagreement about Tesla's factories, its cash, or its energy business — on those they broadly concur at ~USD 127 of operating value. It is disagreement about one thing only: how much to pay today for an unproven, high-payoff future. Expert 3 and Expert 2, each in their discipline, refuse to pay much for what has not yet produced cash; Expert 1 prices the option but is honest that its value rests on a probability. The panel centres near USD 170, essentially on top of the USD 174 fundamental central of §1.5 — reassuring, since the panel and the body share almost no arithmetic. And that every one of the three — including the most generous — lands far below the USD 420.60 spot is the panel's central message: the market is paying more for the autonomy option than even the analyst most willing to price it. This is a valuation, not a recommendation, and not advice.</w:t>
+        <w:t xml:space="preserve">The USD 105-to-USD 350 spread across the three is not disagreement about Tesla's factories, its cash, or its energy business — on those they broadly concur at ~USD 127 of operating value. It is disagreement about one thing only: how much to pay today for an unproven, high-payoff future. Expert 1 pays nothing for it, Expert 2 risk-weights it to ~USD 100 a share, and Expert 3 prices the full option tree and lands within 17% of spot — reaching spot itself if the autonomy outcome is weighted at ~40%. The panel centres near USD 230, straddling the USD 254 fundamental central of §1.5 — reassuring, since the panel and the body share almost no arithmetic. The message is not that Tesla is worth USD 105; it is that the market is paying, in full, for an autonomy outcome that even the analyst most willing to price it weights at roughly one-in-three. This is a valuation, not a recommendation, and not advice.</w:t>
       </w:r>
     </w:p>
     <w:p>

</xml_diff>